<commit_message>
Docs finales sin firmar
</commit_message>
<xml_diff>
--- a/Entregables/Formato1-Final.docx
+++ b/Entregables/Formato1-Final.docx
@@ -1,10 +1,10 @@
 
 <file path=word/document.xml><?xml version="1.0" encoding="utf-8"?>
-<w:document xmlns:wpc="http://schemas.microsoft.com/office/word/2010/wordprocessingCanvas" xmlns:cx="http://schemas.microsoft.com/office/drawing/2014/chartex" xmlns:cx1="http://schemas.microsoft.com/office/drawing/2015/9/8/chartex" xmlns:cx2="http://schemas.microsoft.com/office/drawing/2015/10/21/chartex" xmlns:cx3="http://schemas.microsoft.com/office/drawing/2016/5/9/chartex" xmlns:cx4="http://schemas.microsoft.com/office/drawing/2016/5/10/chartex" xmlns:cx5="http://schemas.microsoft.com/office/drawing/2016/5/11/chartex" xmlns:cx6="http://schemas.microsoft.com/office/drawing/2016/5/12/chartex" xmlns:cx7="http://schemas.microsoft.com/office/drawing/2016/5/13/chartex" xmlns:cx8="http://schemas.microsoft.com/office/drawing/2016/5/14/chartex" xmlns:mc="http://schemas.openxmlformats.org/markup-compatibility/2006" xmlns:aink="http://schemas.microsoft.com/office/drawing/2016/ink" xmlns:am3d="http://schemas.microsoft.com/office/drawing/2017/model3d" xmlns:o="urn:schemas-microsoft-com:office:office" xmlns:oel="http://schemas.microsoft.com/office/2019/extlst" xmlns:r="http://schemas.openxmlformats.org/officeDocument/2006/relationships" xmlns:m="http://schemas.openxmlformats.org/officeDocument/2006/math" xmlns:v="urn:schemas-microsoft-com:vml" xmlns:wp14="http://schemas.microsoft.com/office/word/2010/wordprocessingDrawing" xmlns:wp="http://schemas.openxmlformats.org/drawingml/2006/wordprocessingDrawing" xmlns:w10="urn:schemas-microsoft-com:office:word" xmlns:w="http://schemas.openxmlformats.org/wordprocessingml/2006/main" xmlns:w14="http://schemas.microsoft.com/office/word/2010/wordml" xmlns:w15="http://schemas.microsoft.com/office/word/2012/wordml" xmlns:w16cex="http://schemas.microsoft.com/office/word/2018/wordml/cex" xmlns:w16cid="http://schemas.microsoft.com/office/word/2016/wordml/cid" xmlns:w16="http://schemas.microsoft.com/office/word/2018/wordml" xmlns:w16sdtdh="http://schemas.microsoft.com/office/word/2020/wordml/sdtdatahash" xmlns:w16se="http://schemas.microsoft.com/office/word/2015/wordml/symex" xmlns:wpg="http://schemas.microsoft.com/office/word/2010/wordprocessingGroup" xmlns:wpi="http://schemas.microsoft.com/office/word/2010/wordprocessingInk" xmlns:wne="http://schemas.microsoft.com/office/word/2006/wordml" xmlns:wps="http://schemas.microsoft.com/office/word/2010/wordprocessingShape" mc:Ignorable="w14 w15 w16se w16cid w16 w16cex w16sdtdh wp14">
+<w:document xmlns:wpc="http://schemas.microsoft.com/office/word/2010/wordprocessingCanvas" xmlns:cx="http://schemas.microsoft.com/office/drawing/2014/chartex" xmlns:cx1="http://schemas.microsoft.com/office/drawing/2015/9/8/chartex" xmlns:cx2="http://schemas.microsoft.com/office/drawing/2015/10/21/chartex" xmlns:cx3="http://schemas.microsoft.com/office/drawing/2016/5/9/chartex" xmlns:cx4="http://schemas.microsoft.com/office/drawing/2016/5/10/chartex" xmlns:cx5="http://schemas.microsoft.com/office/drawing/2016/5/11/chartex" xmlns:cx6="http://schemas.microsoft.com/office/drawing/2016/5/12/chartex" xmlns:cx7="http://schemas.microsoft.com/office/drawing/2016/5/13/chartex" xmlns:cx8="http://schemas.microsoft.com/office/drawing/2016/5/14/chartex" xmlns:mc="http://schemas.openxmlformats.org/markup-compatibility/2006" xmlns:aink="http://schemas.microsoft.com/office/drawing/2016/ink" xmlns:am3d="http://schemas.microsoft.com/office/drawing/2017/model3d" xmlns:o="urn:schemas-microsoft-com:office:office" xmlns:r="http://schemas.openxmlformats.org/officeDocument/2006/relationships" xmlns:m="http://schemas.openxmlformats.org/officeDocument/2006/math" xmlns:v="urn:schemas-microsoft-com:vml" xmlns:wp14="http://schemas.microsoft.com/office/word/2010/wordprocessingDrawing" xmlns:wp="http://schemas.openxmlformats.org/drawingml/2006/wordprocessingDrawing" xmlns:w10="urn:schemas-microsoft-com:office:word" xmlns:w="http://schemas.openxmlformats.org/wordprocessingml/2006/main" xmlns:w14="http://schemas.microsoft.com/office/word/2010/wordml" xmlns:w15="http://schemas.microsoft.com/office/word/2012/wordml" xmlns:w16cex="http://schemas.microsoft.com/office/word/2018/wordml/cex" xmlns:w16cid="http://schemas.microsoft.com/office/word/2016/wordml/cid" xmlns:w16="http://schemas.microsoft.com/office/word/2018/wordml" xmlns:w16sdtdh="http://schemas.microsoft.com/office/word/2020/wordml/sdtdatahash" xmlns:w16se="http://schemas.microsoft.com/office/word/2015/wordml/symex" xmlns:wpg="http://schemas.microsoft.com/office/word/2010/wordprocessingGroup" xmlns:wpi="http://schemas.microsoft.com/office/word/2010/wordprocessingInk" xmlns:wne="http://schemas.microsoft.com/office/word/2006/wordml" xmlns:wps="http://schemas.microsoft.com/office/word/2010/wordprocessingShape" mc:Ignorable="w14 w15 w16se w16cid w16 w16cex w16sdtdh wp14">
   <w:body>
     <w:p>
       <w:pPr>
-        <w:pStyle w:val="BodyText"/>
+        <w:pStyle w:val="Textoindependiente"/>
         <w:jc w:val="center"/>
         <w:rPr>
           <w:rFonts w:ascii="Times New Roman" w:hAnsi="Times New Roman"/>
@@ -16,7 +16,7 @@
     </w:p>
     <w:p>
       <w:pPr>
-        <w:pStyle w:val="BodyText"/>
+        <w:pStyle w:val="Textoindependiente"/>
         <w:jc w:val="center"/>
         <w:rPr>
           <w:rFonts w:ascii="Times New Roman" w:hAnsi="Times New Roman"/>
@@ -37,7 +37,7 @@
     </w:p>
     <w:p>
       <w:pPr>
-        <w:pStyle w:val="BodyText"/>
+        <w:pStyle w:val="Textoindependiente"/>
         <w:jc w:val="center"/>
         <w:rPr>
           <w:rFonts w:ascii="Times New Roman" w:hAnsi="Times New Roman"/>
@@ -139,7 +139,7 @@
     </w:p>
     <w:p>
       <w:pPr>
-        <w:pStyle w:val="BodyText"/>
+        <w:pStyle w:val="Textoindependiente"/>
         <w:jc w:val="center"/>
         <w:rPr>
           <w:rFonts w:ascii="Times New Roman" w:hAnsi="Times New Roman"/>
@@ -151,7 +151,7 @@
     </w:p>
     <w:p>
       <w:pPr>
-        <w:pStyle w:val="BodyText"/>
+        <w:pStyle w:val="Textoindependiente"/>
         <w:jc w:val="left"/>
         <w:rPr>
           <w:rFonts w:ascii="Times New Roman" w:hAnsi="Times New Roman"/>
@@ -173,7 +173,7 @@
         <mc:AlternateContent>
           <mc:Choice Requires="wps">
             <w:drawing>
-              <wp:anchor distT="0" distB="0" distL="114300" distR="114300" simplePos="0" relativeHeight="251660288" behindDoc="0" locked="0" layoutInCell="1" allowOverlap="1" wp14:anchorId="3DB4598A" wp14:editId="38684B3F">
+              <wp:anchor distT="0" distB="0" distL="114300" distR="114300" simplePos="0" relativeHeight="251653632" behindDoc="0" locked="0" layoutInCell="1" allowOverlap="1" wp14:anchorId="3DB4598A" wp14:editId="38684B3F">
                 <wp:simplePos x="0" y="0"/>
                 <wp:positionH relativeFrom="column">
                   <wp:posOffset>424815</wp:posOffset>
@@ -246,7 +246,7 @@
               </wp:anchor>
             </w:drawing>
           </mc:Choice>
-          <mc:Fallback>
+          <mc:Fallback xmlns:oel="http://schemas.microsoft.com/office/2019/extlst">
             <w:pict>
               <v:shapetype w14:anchorId="3DB4598A" id="_x0000_t202" coordsize="21600,21600" o:spt="202" path="m,l,21600r21600,l21600,xe">
                 <v:stroke joinstyle="miter"/>
@@ -287,7 +287,7 @@
         <mc:AlternateContent>
           <mc:Choice Requires="wps">
             <w:drawing>
-              <wp:anchor distT="0" distB="0" distL="114300" distR="114300" simplePos="0" relativeHeight="251659264" behindDoc="0" locked="0" layoutInCell="1" allowOverlap="1" wp14:anchorId="0D061731" wp14:editId="68B82BD5">
+              <wp:anchor distT="0" distB="0" distL="114300" distR="114300" simplePos="0" relativeHeight="251651584" behindDoc="0" locked="0" layoutInCell="1" allowOverlap="1" wp14:anchorId="0D061731" wp14:editId="68B82BD5">
                 <wp:simplePos x="0" y="0"/>
                 <wp:positionH relativeFrom="column">
                   <wp:posOffset>3272790</wp:posOffset>
@@ -348,7 +348,7 @@
               </wp:anchor>
             </w:drawing>
           </mc:Choice>
-          <mc:Fallback>
+          <mc:Fallback xmlns:oel="http://schemas.microsoft.com/office/2019/extlst">
             <w:pict>
               <v:shape w14:anchorId="0D061731" id="_x0000_s1027" type="#_x0000_t202" style="position:absolute;margin-left:257.7pt;margin-top:10.35pt;width:22.5pt;height:14.25pt;z-index:251659264;visibility:visible;mso-wrap-style:square;mso-width-percent:0;mso-height-percent:0;mso-wrap-distance-left:9pt;mso-wrap-distance-top:0;mso-wrap-distance-right:9pt;mso-wrap-distance-bottom:0;mso-position-horizontal:absolute;mso-position-horizontal-relative:text;mso-position-vertical:absolute;mso-position-vertical-relative:text;mso-width-percent:0;mso-height-percent:0;mso-width-relative:margin;mso-height-relative:margin;v-text-anchor:top" o:gfxdata="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">
                 <v:textbox>
@@ -364,7 +364,7 @@
     </w:p>
     <w:p>
       <w:pPr>
-        <w:pStyle w:val="BodyText"/>
+        <w:pStyle w:val="Textoindependiente"/>
         <w:ind w:left="708" w:firstLine="708"/>
         <w:jc w:val="left"/>
         <w:rPr>
@@ -488,7 +488,7 @@
     </w:p>
     <w:p>
       <w:pPr>
-        <w:pStyle w:val="BodyText"/>
+        <w:pStyle w:val="Textoindependiente"/>
         <w:jc w:val="left"/>
         <w:rPr>
           <w:rFonts w:ascii="Times New Roman" w:hAnsi="Times New Roman"/>
@@ -510,7 +510,7 @@
         <mc:AlternateContent>
           <mc:Choice Requires="wps">
             <w:drawing>
-              <wp:anchor distT="0" distB="0" distL="114300" distR="114300" simplePos="0" relativeHeight="251696128" behindDoc="0" locked="0" layoutInCell="1" allowOverlap="1" wp14:anchorId="4ADBD973" wp14:editId="278CA61D">
+              <wp:anchor distT="0" distB="0" distL="114300" distR="114300" simplePos="0" relativeHeight="251663872" behindDoc="0" locked="0" layoutInCell="1" allowOverlap="1" wp14:anchorId="4ADBD973" wp14:editId="278CA61D">
                 <wp:simplePos x="0" y="0"/>
                 <wp:positionH relativeFrom="column">
                   <wp:posOffset>3272790</wp:posOffset>
@@ -571,7 +571,7 @@
               </wp:anchor>
             </w:drawing>
           </mc:Choice>
-          <mc:Fallback>
+          <mc:Fallback xmlns:oel="http://schemas.microsoft.com/office/2019/extlst">
             <w:pict>
               <v:shape w14:anchorId="4ADBD973" id="_x0000_s1028" type="#_x0000_t202" style="position:absolute;margin-left:257.7pt;margin-top:9.6pt;width:22.5pt;height:14.25pt;z-index:251696128;visibility:visible;mso-wrap-style:square;mso-width-percent:0;mso-height-percent:0;mso-wrap-distance-left:9pt;mso-wrap-distance-top:0;mso-wrap-distance-right:9pt;mso-wrap-distance-bottom:0;mso-position-horizontal:absolute;mso-position-horizontal-relative:text;mso-position-vertical:absolute;mso-position-vertical-relative:text;mso-width-percent:0;mso-height-percent:0;mso-width-relative:margin;mso-height-relative:margin;v-text-anchor:top" o:gfxdata="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">
                 <v:textbox>
@@ -596,7 +596,7 @@
         <mc:AlternateContent>
           <mc:Choice Requires="wps">
             <w:drawing>
-              <wp:anchor distT="0" distB="0" distL="114300" distR="114300" simplePos="0" relativeHeight="251695104" behindDoc="0" locked="0" layoutInCell="1" allowOverlap="1" wp14:anchorId="6F31F434" wp14:editId="04BB83D6">
+              <wp:anchor distT="0" distB="0" distL="114300" distR="114300" simplePos="0" relativeHeight="251662848" behindDoc="0" locked="0" layoutInCell="1" allowOverlap="1" wp14:anchorId="6F31F434" wp14:editId="04BB83D6">
                 <wp:simplePos x="0" y="0"/>
                 <wp:positionH relativeFrom="column">
                   <wp:posOffset>424815</wp:posOffset>
@@ -657,7 +657,7 @@
               </wp:anchor>
             </w:drawing>
           </mc:Choice>
-          <mc:Fallback>
+          <mc:Fallback xmlns:oel="http://schemas.microsoft.com/office/2019/extlst">
             <w:pict>
               <v:shape w14:anchorId="6F31F434" id="_x0000_s1029" type="#_x0000_t202" style="position:absolute;margin-left:33.45pt;margin-top:8.25pt;width:22.5pt;height:14.25pt;z-index:251695104;visibility:visible;mso-wrap-style:square;mso-width-percent:0;mso-height-percent:0;mso-wrap-distance-left:9pt;mso-wrap-distance-top:0;mso-wrap-distance-right:9pt;mso-wrap-distance-bottom:0;mso-position-horizontal:absolute;mso-position-horizontal-relative:text;mso-position-vertical:absolute;mso-position-vertical-relative:text;mso-width-percent:0;mso-height-percent:0;mso-width-relative:margin;mso-height-relative:margin;v-text-anchor:top" o:gfxdata="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">
                 <v:textbox>
@@ -673,7 +673,7 @@
     </w:p>
     <w:p>
       <w:pPr>
-        <w:pStyle w:val="BodyText"/>
+        <w:pStyle w:val="Textoindependiente"/>
         <w:ind w:left="708" w:firstLine="708"/>
         <w:jc w:val="left"/>
         <w:rPr>
@@ -757,7 +757,7 @@
     </w:p>
     <w:p>
       <w:pPr>
-        <w:pStyle w:val="BodyText"/>
+        <w:pStyle w:val="Textoindependiente"/>
         <w:jc w:val="left"/>
         <w:rPr>
           <w:rFonts w:ascii="Times New Roman" w:hAnsi="Times New Roman"/>
@@ -779,7 +779,7 @@
         <mc:AlternateContent>
           <mc:Choice Requires="wps">
             <w:drawing>
-              <wp:anchor distT="0" distB="0" distL="114300" distR="114300" simplePos="0" relativeHeight="251697152" behindDoc="0" locked="0" layoutInCell="1" allowOverlap="1" wp14:anchorId="6A727084" wp14:editId="354E9A2D">
+              <wp:anchor distT="0" distB="0" distL="114300" distR="114300" simplePos="0" relativeHeight="251664896" behindDoc="0" locked="0" layoutInCell="1" allowOverlap="1" wp14:anchorId="6A727084" wp14:editId="354E9A2D">
                 <wp:simplePos x="0" y="0"/>
                 <wp:positionH relativeFrom="column">
                   <wp:posOffset>424815</wp:posOffset>
@@ -840,7 +840,7 @@
               </wp:anchor>
             </w:drawing>
           </mc:Choice>
-          <mc:Fallback>
+          <mc:Fallback xmlns:oel="http://schemas.microsoft.com/office/2019/extlst">
             <w:pict>
               <v:shape w14:anchorId="6A727084" id="_x0000_s1030" type="#_x0000_t202" style="position:absolute;margin-left:33.45pt;margin-top:8.55pt;width:22.5pt;height:14.25pt;z-index:251697152;visibility:visible;mso-wrap-style:square;mso-width-percent:0;mso-height-percent:0;mso-wrap-distance-left:9pt;mso-wrap-distance-top:0;mso-wrap-distance-right:9pt;mso-wrap-distance-bottom:0;mso-position-horizontal:absolute;mso-position-horizontal-relative:text;mso-position-vertical:absolute;mso-position-vertical-relative:text;mso-width-percent:0;mso-height-percent:0;mso-width-relative:margin;mso-height-relative:margin;v-text-anchor:top" o:gfxdata="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">
                 <v:textbox>
@@ -866,7 +866,7 @@
     </w:p>
     <w:p>
       <w:pPr>
-        <w:pStyle w:val="BodyText"/>
+        <w:pStyle w:val="Textoindependiente"/>
         <w:jc w:val="left"/>
         <w:rPr>
           <w:rFonts w:ascii="Times New Roman" w:hAnsi="Times New Roman"/>
@@ -929,7 +929,7 @@
     </w:p>
     <w:p>
       <w:pPr>
-        <w:pStyle w:val="BodyText"/>
+        <w:pStyle w:val="Textoindependiente"/>
         <w:jc w:val="left"/>
         <w:rPr>
           <w:rFonts w:ascii="Times New Roman" w:hAnsi="Times New Roman"/>
@@ -942,7 +942,7 @@
     </w:p>
     <w:p>
       <w:pPr>
-        <w:pStyle w:val="BodyText"/>
+        <w:pStyle w:val="Textoindependiente"/>
         <w:jc w:val="left"/>
         <w:rPr>
           <w:rFonts w:ascii="Times New Roman" w:hAnsi="Times New Roman"/>
@@ -965,7 +965,7 @@
     </w:p>
     <w:p>
       <w:pPr>
-        <w:pStyle w:val="BodyText"/>
+        <w:pStyle w:val="Textoindependiente"/>
         <w:jc w:val="left"/>
         <w:rPr>
           <w:rFonts w:ascii="Times New Roman" w:hAnsi="Times New Roman"/>
@@ -978,7 +978,7 @@
     </w:p>
     <w:p>
       <w:pPr>
-        <w:pStyle w:val="BodyText"/>
+        <w:pStyle w:val="Textoindependiente"/>
         <w:jc w:val="left"/>
         <w:rPr>
           <w:rFonts w:ascii="Times New Roman" w:hAnsi="Times New Roman"/>
@@ -1029,7 +1029,7 @@
     </w:p>
     <w:p>
       <w:pPr>
-        <w:pStyle w:val="BodyText"/>
+        <w:pStyle w:val="Textoindependiente"/>
         <w:jc w:val="left"/>
         <w:rPr>
           <w:rFonts w:ascii="Times New Roman" w:hAnsi="Times New Roman"/>
@@ -1100,7 +1100,7 @@
     </w:p>
     <w:p>
       <w:pPr>
-        <w:pStyle w:val="BodyText"/>
+        <w:pStyle w:val="Textoindependiente"/>
         <w:jc w:val="left"/>
         <w:rPr>
           <w:rFonts w:ascii="Times New Roman" w:hAnsi="Times New Roman"/>
@@ -1113,7 +1113,7 @@
     </w:p>
     <w:p>
       <w:pPr>
-        <w:pStyle w:val="BodyText"/>
+        <w:pStyle w:val="Textoindependiente"/>
         <w:numPr>
           <w:ilvl w:val="0"/>
           <w:numId w:val="1"/>
@@ -1143,7 +1143,7 @@
     </w:p>
     <w:p>
       <w:pPr>
-        <w:pStyle w:val="BodyText"/>
+        <w:pStyle w:val="Textoindependiente"/>
         <w:numPr>
           <w:ilvl w:val="1"/>
           <w:numId w:val="1"/>
@@ -1191,7 +1191,7 @@
     </w:p>
     <w:p>
       <w:pPr>
-        <w:pStyle w:val="BodyText"/>
+        <w:pStyle w:val="Textoindependiente"/>
         <w:spacing w:line="360" w:lineRule="auto"/>
         <w:ind w:left="426"/>
         <w:jc w:val="left"/>
@@ -1253,7 +1253,7 @@
     </w:p>
     <w:p>
       <w:pPr>
-        <w:pStyle w:val="BodyText"/>
+        <w:pStyle w:val="Textoindependiente"/>
         <w:spacing w:line="360" w:lineRule="auto"/>
         <w:ind w:left="426"/>
         <w:jc w:val="left"/>
@@ -1347,7 +1347,7 @@
     </w:p>
     <w:p>
       <w:pPr>
-        <w:pStyle w:val="BodyText"/>
+        <w:pStyle w:val="Textoindependiente"/>
         <w:spacing w:line="360" w:lineRule="auto"/>
         <w:ind w:left="426"/>
         <w:jc w:val="left"/>
@@ -1416,7 +1416,7 @@
     </w:p>
     <w:p>
       <w:pPr>
-        <w:pStyle w:val="BodyText"/>
+        <w:pStyle w:val="Textoindependiente"/>
         <w:spacing w:line="360" w:lineRule="auto"/>
         <w:ind w:left="765"/>
         <w:jc w:val="left"/>
@@ -1431,7 +1431,7 @@
     </w:p>
     <w:p>
       <w:pPr>
-        <w:pStyle w:val="BodyText"/>
+        <w:pStyle w:val="Textoindependiente"/>
         <w:numPr>
           <w:ilvl w:val="1"/>
           <w:numId w:val="1"/>
@@ -1479,7 +1479,7 @@
     </w:p>
     <w:p>
       <w:pPr>
-        <w:pStyle w:val="BodyText"/>
+        <w:pStyle w:val="Textoindependiente"/>
         <w:spacing w:line="360" w:lineRule="auto"/>
         <w:ind w:left="357"/>
         <w:jc w:val="left"/>
@@ -1512,7 +1512,7 @@
     </w:p>
     <w:p>
       <w:pPr>
-        <w:pStyle w:val="BodyText"/>
+        <w:pStyle w:val="Textoindependiente"/>
         <w:spacing w:line="360" w:lineRule="auto"/>
         <w:ind w:left="360"/>
         <w:jc w:val="left"/>
@@ -1554,7 +1554,7 @@
     </w:p>
     <w:p>
       <w:pPr>
-        <w:pStyle w:val="BodyText"/>
+        <w:pStyle w:val="Textoindependiente"/>
         <w:spacing w:line="360" w:lineRule="auto"/>
         <w:ind w:left="360"/>
         <w:jc w:val="left"/>
@@ -1667,7 +1667,7 @@
     </w:p>
     <w:p>
       <w:pPr>
-        <w:pStyle w:val="BodyText"/>
+        <w:pStyle w:val="Textoindependiente"/>
         <w:spacing w:line="360" w:lineRule="auto"/>
         <w:ind w:left="360"/>
         <w:jc w:val="left"/>
@@ -1681,7 +1681,7 @@
     </w:p>
     <w:p>
       <w:pPr>
-        <w:pStyle w:val="BodyText"/>
+        <w:pStyle w:val="Textoindependiente"/>
         <w:numPr>
           <w:ilvl w:val="1"/>
           <w:numId w:val="1"/>
@@ -1709,7 +1709,7 @@
     </w:p>
     <w:p>
       <w:pPr>
-        <w:pStyle w:val="BodyText"/>
+        <w:pStyle w:val="Textoindependiente"/>
         <w:spacing w:line="360" w:lineRule="auto"/>
         <w:ind w:left="360"/>
         <w:jc w:val="left"/>
@@ -1751,7 +1751,7 @@
     </w:p>
     <w:p>
       <w:pPr>
-        <w:pStyle w:val="BodyText"/>
+        <w:pStyle w:val="Textoindependiente"/>
         <w:spacing w:line="360" w:lineRule="auto"/>
         <w:ind w:left="360"/>
         <w:jc w:val="left"/>
@@ -1821,7 +1821,7 @@
     </w:p>
     <w:p>
       <w:pPr>
-        <w:pStyle w:val="BodyText"/>
+        <w:pStyle w:val="Textoindependiente"/>
         <w:spacing w:line="360" w:lineRule="auto"/>
         <w:ind w:left="360"/>
         <w:jc w:val="left"/>
@@ -1894,7 +1894,7 @@
     </w:p>
     <w:p>
       <w:pPr>
-        <w:pStyle w:val="BodyText"/>
+        <w:pStyle w:val="Textoindependiente"/>
         <w:spacing w:line="360" w:lineRule="auto"/>
         <w:ind w:left="360"/>
         <w:jc w:val="left"/>
@@ -1985,7 +1985,7 @@
     </w:p>
     <w:p>
       <w:pPr>
-        <w:pStyle w:val="BodyText"/>
+        <w:pStyle w:val="Textoindependiente"/>
         <w:spacing w:line="360" w:lineRule="auto"/>
         <w:ind w:left="765"/>
         <w:jc w:val="left"/>
@@ -2000,7 +2000,7 @@
     </w:p>
     <w:p>
       <w:pPr>
-        <w:pStyle w:val="BodyText"/>
+        <w:pStyle w:val="Textoindependiente"/>
         <w:numPr>
           <w:ilvl w:val="1"/>
           <w:numId w:val="1"/>
@@ -2028,7 +2028,7 @@
     </w:p>
     <w:p>
       <w:pPr>
-        <w:pStyle w:val="BodyText"/>
+        <w:pStyle w:val="Textoindependiente"/>
         <w:spacing w:line="360" w:lineRule="auto"/>
         <w:ind w:left="360"/>
         <w:jc w:val="left"/>
@@ -2070,7 +2070,7 @@
     </w:p>
     <w:p>
       <w:pPr>
-        <w:pStyle w:val="BodyText"/>
+        <w:pStyle w:val="Textoindependiente"/>
         <w:spacing w:line="360" w:lineRule="auto"/>
         <w:ind w:left="360"/>
         <w:jc w:val="left"/>
@@ -2152,7 +2152,7 @@
     </w:p>
     <w:p>
       <w:pPr>
-        <w:pStyle w:val="BodyText"/>
+        <w:pStyle w:val="Textoindependiente"/>
         <w:spacing w:line="360" w:lineRule="auto"/>
         <w:ind w:left="360"/>
         <w:jc w:val="left"/>
@@ -2225,7 +2225,7 @@
     </w:p>
     <w:p>
       <w:pPr>
-        <w:pStyle w:val="BodyText"/>
+        <w:pStyle w:val="Textoindependiente"/>
         <w:spacing w:line="360" w:lineRule="auto"/>
         <w:ind w:left="360"/>
         <w:jc w:val="left"/>
@@ -2240,7 +2240,7 @@
     </w:p>
     <w:p>
       <w:pPr>
-        <w:pStyle w:val="BodyText"/>
+        <w:pStyle w:val="Textoindependiente"/>
         <w:numPr>
           <w:ilvl w:val="0"/>
           <w:numId w:val="1"/>
@@ -2268,7 +2268,7 @@
       </w:r>
       <w:r>
         <w:rPr>
-          <w:rStyle w:val="FootnoteReference"/>
+          <w:rStyle w:val="Refdenotaalpie"/>
           <w:rFonts w:ascii="Times New Roman" w:hAnsi="Times New Roman"/>
           <w:b/>
           <w:sz w:val="20"/>
@@ -2292,7 +2292,7 @@
     </w:p>
     <w:p>
       <w:pPr>
-        <w:pStyle w:val="BodyText"/>
+        <w:pStyle w:val="Textoindependiente"/>
         <w:ind w:firstLine="360"/>
         <w:jc w:val="left"/>
         <w:rPr>
@@ -2306,7 +2306,7 @@
     </w:p>
     <w:p>
       <w:pPr>
-        <w:pStyle w:val="BodyText"/>
+        <w:pStyle w:val="Textoindependiente"/>
         <w:jc w:val="left"/>
         <w:rPr>
           <w:rFonts w:ascii="Times New Roman" w:hAnsi="Times New Roman"/>
@@ -2328,7 +2328,7 @@
         <mc:AlternateContent>
           <mc:Choice Requires="wps">
             <w:drawing>
-              <wp:anchor distT="0" distB="0" distL="114300" distR="114300" simplePos="0" relativeHeight="251692032" behindDoc="0" locked="0" layoutInCell="1" allowOverlap="1" wp14:anchorId="43535B15" wp14:editId="55A85F87">
+              <wp:anchor distT="0" distB="0" distL="114300" distR="114300" simplePos="0" relativeHeight="251660800" behindDoc="0" locked="0" layoutInCell="1" allowOverlap="1" wp14:anchorId="43535B15" wp14:editId="55A85F87">
                 <wp:simplePos x="0" y="0"/>
                 <wp:positionH relativeFrom="column">
                   <wp:posOffset>872490</wp:posOffset>
@@ -2456,7 +2456,7 @@
               </wp:anchor>
             </w:drawing>
           </mc:Choice>
-          <mc:Fallback>
+          <mc:Fallback xmlns:oel="http://schemas.microsoft.com/office/2019/extlst">
             <w:pict>
               <v:shape w14:anchorId="43535B15" id="_x0000_s1031" type="#_x0000_t202" style="position:absolute;margin-left:68.7pt;margin-top:1.7pt;width:97.5pt;height:27pt;z-index:251692032;visibility:visible;mso-wrap-style:square;mso-width-percent:0;mso-height-percent:0;mso-wrap-distance-left:9pt;mso-wrap-distance-top:0;mso-wrap-distance-right:9pt;mso-wrap-distance-bottom:0;mso-position-horizontal:absolute;mso-position-horizontal-relative:text;mso-position-vertical:absolute;mso-position-vertical-relative:text;mso-width-percent:0;mso-height-percent:0;mso-width-relative:margin;mso-height-relative:margin;v-text-anchor:top" o:gfxdata="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">
                 <v:textbox>
@@ -2548,7 +2548,7 @@
         <mc:AlternateContent>
           <mc:Choice Requires="wps">
             <w:drawing>
-              <wp:anchor distT="0" distB="0" distL="114300" distR="114300" simplePos="0" relativeHeight="251694080" behindDoc="0" locked="0" layoutInCell="1" allowOverlap="1" wp14:anchorId="6FDA1A61" wp14:editId="664743ED">
+              <wp:anchor distT="0" distB="0" distL="114300" distR="114300" simplePos="0" relativeHeight="251661824" behindDoc="0" locked="0" layoutInCell="1" allowOverlap="1" wp14:anchorId="6FDA1A61" wp14:editId="664743ED">
                 <wp:simplePos x="0" y="0"/>
                 <wp:positionH relativeFrom="column">
                   <wp:posOffset>3882390</wp:posOffset>
@@ -2688,7 +2688,7 @@
               </wp:anchor>
             </w:drawing>
           </mc:Choice>
-          <mc:Fallback>
+          <mc:Fallback xmlns:oel="http://schemas.microsoft.com/office/2019/extlst">
             <w:pict>
               <v:shape w14:anchorId="6FDA1A61" id="_x0000_s1032" type="#_x0000_t202" style="position:absolute;margin-left:305.7pt;margin-top:.95pt;width:97.5pt;height:27.75pt;z-index:251694080;visibility:visible;mso-wrap-style:square;mso-width-percent:0;mso-height-percent:0;mso-wrap-distance-left:9pt;mso-wrap-distance-top:0;mso-wrap-distance-right:9pt;mso-wrap-distance-bottom:0;mso-position-horizontal:absolute;mso-position-horizontal-relative:text;mso-position-vertical:absolute;mso-position-vertical-relative:text;mso-width-percent:0;mso-height-percent:0;mso-width-relative:margin;mso-height-relative:margin;v-text-anchor:top" o:gfxdata="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">
                 <v:textbox>
@@ -2905,7 +2905,7 @@
         <mc:AlternateContent>
           <mc:Choice Requires="wps">
             <w:drawing>
-              <wp:anchor distT="0" distB="0" distL="114300" distR="114300" simplePos="0" relativeHeight="251677696" behindDoc="0" locked="0" layoutInCell="1" allowOverlap="1" wp14:anchorId="1D32EEB5" wp14:editId="214BFAC8">
+              <wp:anchor distT="0" distB="0" distL="114300" distR="114300" simplePos="0" relativeHeight="251654656" behindDoc="0" locked="0" layoutInCell="1" allowOverlap="1" wp14:anchorId="1D32EEB5" wp14:editId="214BFAC8">
                 <wp:simplePos x="0" y="0"/>
                 <wp:positionH relativeFrom="column">
                   <wp:posOffset>977265</wp:posOffset>
@@ -3022,7 +3022,7 @@
               </wp:anchor>
             </w:drawing>
           </mc:Choice>
-          <mc:Fallback>
+          <mc:Fallback xmlns:oel="http://schemas.microsoft.com/office/2019/extlst">
             <w:pict>
               <v:rect w14:anchorId="1D32EEB5" id="10 Rectángulo" o:spid="_x0000_s1033" style="position:absolute;margin-left:76.95pt;margin-top:15.2pt;width:89.25pt;height:27pt;z-index:251677696;visibility:visible;mso-wrap-style:square;mso-width-percent:0;mso-height-percent:0;mso-wrap-distance-left:9pt;mso-wrap-distance-top:0;mso-wrap-distance-right:9pt;mso-wrap-distance-bottom:0;mso-position-horizontal:absolute;mso-position-horizontal-relative:text;mso-position-vertical:absolute;mso-position-vertical-relative:text;mso-width-percent:0;mso-height-percent:0;mso-width-relative:margin;mso-height-relative:margin;v-text-anchor:middle" o:gfxdata="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" fillcolor="white [3201]" strokecolor="black [3200]" strokeweight=".25pt">
                 <v:path arrowok="t"/>
@@ -3095,7 +3095,7 @@
         <mc:AlternateContent>
           <mc:Choice Requires="wps">
             <w:drawing>
-              <wp:anchor distT="0" distB="0" distL="114300" distR="114300" simplePos="0" relativeHeight="251679744" behindDoc="0" locked="0" layoutInCell="1" allowOverlap="1" wp14:anchorId="45FC45C8" wp14:editId="517EB877">
+              <wp:anchor distT="0" distB="0" distL="114300" distR="114300" simplePos="0" relativeHeight="251655680" behindDoc="0" locked="0" layoutInCell="1" allowOverlap="1" wp14:anchorId="45FC45C8" wp14:editId="517EB877">
                 <wp:simplePos x="0" y="0"/>
                 <wp:positionH relativeFrom="column">
                   <wp:posOffset>3977640</wp:posOffset>
@@ -3182,7 +3182,7 @@
               </wp:anchor>
             </w:drawing>
           </mc:Choice>
-          <mc:Fallback>
+          <mc:Fallback xmlns:oel="http://schemas.microsoft.com/office/2019/extlst">
             <w:pict>
               <v:rect w14:anchorId="45FC45C8" id="11 Rectángulo" o:spid="_x0000_s1034" style="position:absolute;margin-left:313.2pt;margin-top:15.2pt;width:56.25pt;height:22.3pt;z-index:251679744;visibility:visible;mso-wrap-style:square;mso-width-percent:0;mso-height-percent:0;mso-wrap-distance-left:9pt;mso-wrap-distance-top:0;mso-wrap-distance-right:9pt;mso-wrap-distance-bottom:0;mso-position-horizontal:absolute;mso-position-horizontal-relative:text;mso-position-vertical:absolute;mso-position-vertical-relative:text;mso-width-percent:0;mso-height-percent:0;mso-width-relative:page;mso-height-relative:page;v-text-anchor:middle" o:gfxdata="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" fillcolor="white [3201]" strokecolor="black [3200]" strokeweight=".25pt">
                 <v:path arrowok="t"/>
@@ -3297,7 +3297,7 @@
     </w:p>
     <w:p>
       <w:pPr>
-        <w:pStyle w:val="BodyText"/>
+        <w:pStyle w:val="Textoindependiente"/>
         <w:ind w:firstLine="360"/>
         <w:jc w:val="left"/>
         <w:rPr>
@@ -3311,7 +3311,7 @@
     </w:p>
     <w:p>
       <w:pPr>
-        <w:pStyle w:val="BodyText"/>
+        <w:pStyle w:val="Textoindependiente"/>
         <w:ind w:firstLine="360"/>
         <w:jc w:val="left"/>
         <w:rPr>
@@ -3325,7 +3325,7 @@
     </w:p>
     <w:p>
       <w:pPr>
-        <w:pStyle w:val="BodyText"/>
+        <w:pStyle w:val="Textoindependiente"/>
         <w:ind w:firstLine="360"/>
         <w:jc w:val="left"/>
         <w:rPr>
@@ -3349,7 +3349,7 @@
     </w:p>
     <w:p>
       <w:pPr>
-        <w:pStyle w:val="BodyText"/>
+        <w:pStyle w:val="Textoindependiente"/>
         <w:numPr>
           <w:ilvl w:val="0"/>
           <w:numId w:val="1"/>
@@ -3413,7 +3413,7 @@
     </w:p>
     <w:p>
       <w:pPr>
-        <w:pStyle w:val="BodyText"/>
+        <w:pStyle w:val="Textoindependiente"/>
         <w:numPr>
           <w:ilvl w:val="0"/>
           <w:numId w:val="2"/>
@@ -3464,7 +3464,7 @@
     </w:p>
     <w:p>
       <w:pPr>
-        <w:pStyle w:val="BodyText"/>
+        <w:pStyle w:val="Textoindependiente"/>
         <w:spacing w:line="360" w:lineRule="auto"/>
         <w:ind w:left="720"/>
         <w:rPr>
@@ -3479,7 +3479,7 @@
     </w:p>
     <w:p>
       <w:pPr>
-        <w:pStyle w:val="BodyText"/>
+        <w:pStyle w:val="Textoindependiente"/>
         <w:numPr>
           <w:ilvl w:val="0"/>
           <w:numId w:val="2"/>
@@ -3536,7 +3536,7 @@
     </w:p>
     <w:p>
       <w:pPr>
-        <w:pStyle w:val="BodyText"/>
+        <w:pStyle w:val="Textoindependiente"/>
         <w:spacing w:after="240" w:line="360" w:lineRule="auto"/>
         <w:ind w:left="720"/>
         <w:rPr>
@@ -3550,7 +3550,7 @@
     </w:p>
     <w:p>
       <w:pPr>
-        <w:pStyle w:val="BodyText"/>
+        <w:pStyle w:val="Textoindependiente"/>
         <w:numPr>
           <w:ilvl w:val="0"/>
           <w:numId w:val="1"/>
@@ -3627,7 +3627,7 @@
           </w:tcPr>
           <w:p>
             <w:pPr>
-              <w:pStyle w:val="BodyText"/>
+              <w:pStyle w:val="Textoindependiente"/>
               <w:jc w:val="center"/>
               <w:rPr>
                 <w:rFonts w:ascii="Times New Roman" w:hAnsi="Times New Roman"/>
@@ -3656,7 +3656,7 @@
           </w:tcPr>
           <w:p>
             <w:pPr>
-              <w:pStyle w:val="BodyText"/>
+              <w:pStyle w:val="Textoindependiente"/>
               <w:jc w:val="center"/>
               <w:rPr>
                 <w:rFonts w:ascii="Times New Roman" w:hAnsi="Times New Roman"/>
@@ -3685,7 +3685,7 @@
           </w:tcPr>
           <w:p>
             <w:pPr>
-              <w:pStyle w:val="BodyText"/>
+              <w:pStyle w:val="Textoindependiente"/>
               <w:jc w:val="center"/>
               <w:rPr>
                 <w:rFonts w:ascii="Times New Roman" w:hAnsi="Times New Roman"/>
@@ -3743,7 +3743,7 @@
           </w:tcPr>
           <w:p>
             <w:pPr>
-              <w:pStyle w:val="BodyText"/>
+              <w:pStyle w:val="Textoindependiente"/>
               <w:jc w:val="left"/>
               <w:rPr>
                 <w:rFonts w:ascii="Times New Roman" w:hAnsi="Times New Roman"/>
@@ -3771,7 +3771,7 @@
           </w:tcPr>
           <w:p>
             <w:pPr>
-              <w:pStyle w:val="BodyText"/>
+              <w:pStyle w:val="Textoindependiente"/>
               <w:jc w:val="left"/>
               <w:rPr>
                 <w:rFonts w:ascii="Times New Roman" w:hAnsi="Times New Roman"/>
@@ -3828,7 +3828,7 @@
           </w:tcPr>
           <w:p>
             <w:pPr>
-              <w:pStyle w:val="BodyText"/>
+              <w:pStyle w:val="Textoindependiente"/>
               <w:jc w:val="left"/>
               <w:rPr>
                 <w:rFonts w:ascii="Times New Roman" w:hAnsi="Times New Roman"/>
@@ -3856,7 +3856,7 @@
           </w:tcPr>
           <w:p>
             <w:pPr>
-              <w:pStyle w:val="BodyText"/>
+              <w:pStyle w:val="Textoindependiente"/>
               <w:jc w:val="left"/>
               <w:rPr>
                 <w:rFonts w:ascii="Times New Roman" w:hAnsi="Times New Roman"/>
@@ -3913,7 +3913,7 @@
           </w:tcPr>
           <w:p>
             <w:pPr>
-              <w:pStyle w:val="BodyText"/>
+              <w:pStyle w:val="Textoindependiente"/>
               <w:jc w:val="left"/>
               <w:rPr>
                 <w:rFonts w:ascii="Times New Roman" w:hAnsi="Times New Roman"/>
@@ -3941,7 +3941,7 @@
           </w:tcPr>
           <w:p>
             <w:pPr>
-              <w:pStyle w:val="BodyText"/>
+              <w:pStyle w:val="Textoindependiente"/>
               <w:jc w:val="left"/>
               <w:rPr>
                 <w:rFonts w:ascii="Times New Roman" w:hAnsi="Times New Roman"/>
@@ -3998,7 +3998,7 @@
           </w:tcPr>
           <w:p>
             <w:pPr>
-              <w:pStyle w:val="BodyText"/>
+              <w:pStyle w:val="Textoindependiente"/>
               <w:jc w:val="left"/>
               <w:rPr>
                 <w:rFonts w:ascii="Times New Roman" w:hAnsi="Times New Roman"/>
@@ -4026,7 +4026,7 @@
           </w:tcPr>
           <w:p>
             <w:pPr>
-              <w:pStyle w:val="BodyText"/>
+              <w:pStyle w:val="Textoindependiente"/>
               <w:jc w:val="left"/>
               <w:rPr>
                 <w:rFonts w:ascii="Times New Roman" w:hAnsi="Times New Roman"/>
@@ -4083,7 +4083,7 @@
           </w:tcPr>
           <w:p>
             <w:pPr>
-              <w:pStyle w:val="BodyText"/>
+              <w:pStyle w:val="Textoindependiente"/>
               <w:jc w:val="left"/>
               <w:rPr>
                 <w:rFonts w:ascii="Times New Roman" w:hAnsi="Times New Roman"/>
@@ -4121,7 +4121,7 @@
           </w:tcPr>
           <w:p>
             <w:pPr>
-              <w:pStyle w:val="BodyText"/>
+              <w:pStyle w:val="Textoindependiente"/>
               <w:jc w:val="left"/>
               <w:rPr>
                 <w:rFonts w:ascii="Times New Roman" w:hAnsi="Times New Roman"/>
@@ -4178,7 +4178,7 @@
           </w:tcPr>
           <w:p>
             <w:pPr>
-              <w:pStyle w:val="BodyText"/>
+              <w:pStyle w:val="Textoindependiente"/>
               <w:jc w:val="left"/>
               <w:rPr>
                 <w:rFonts w:ascii="Times New Roman" w:hAnsi="Times New Roman"/>
@@ -4206,7 +4206,7 @@
           </w:tcPr>
           <w:p>
             <w:pPr>
-              <w:pStyle w:val="BodyText"/>
+              <w:pStyle w:val="Textoindependiente"/>
               <w:jc w:val="left"/>
               <w:rPr>
                 <w:rFonts w:ascii="Times New Roman" w:hAnsi="Times New Roman"/>
@@ -4263,7 +4263,7 @@
           </w:tcPr>
           <w:p>
             <w:pPr>
-              <w:pStyle w:val="BodyText"/>
+              <w:pStyle w:val="Textoindependiente"/>
               <w:jc w:val="left"/>
               <w:rPr>
                 <w:rFonts w:ascii="Times New Roman" w:hAnsi="Times New Roman"/>
@@ -4291,7 +4291,7 @@
           </w:tcPr>
           <w:p>
             <w:pPr>
-              <w:pStyle w:val="BodyText"/>
+              <w:pStyle w:val="Textoindependiente"/>
               <w:jc w:val="left"/>
               <w:rPr>
                 <w:rFonts w:ascii="Times New Roman" w:hAnsi="Times New Roman"/>
@@ -4348,7 +4348,7 @@
           </w:tcPr>
           <w:p>
             <w:pPr>
-              <w:pStyle w:val="BodyText"/>
+              <w:pStyle w:val="Textoindependiente"/>
               <w:jc w:val="left"/>
               <w:rPr>
                 <w:rFonts w:ascii="Times New Roman" w:hAnsi="Times New Roman"/>
@@ -4376,7 +4376,7 @@
           </w:tcPr>
           <w:p>
             <w:pPr>
-              <w:pStyle w:val="BodyText"/>
+              <w:pStyle w:val="Textoindependiente"/>
               <w:jc w:val="left"/>
               <w:rPr>
                 <w:rFonts w:ascii="Times New Roman" w:hAnsi="Times New Roman"/>
@@ -4433,7 +4433,7 @@
           </w:tcPr>
           <w:p>
             <w:pPr>
-              <w:pStyle w:val="BodyText"/>
+              <w:pStyle w:val="Textoindependiente"/>
               <w:jc w:val="left"/>
               <w:rPr>
                 <w:rFonts w:ascii="Times New Roman" w:hAnsi="Times New Roman"/>
@@ -4461,7 +4461,7 @@
           </w:tcPr>
           <w:p>
             <w:pPr>
-              <w:pStyle w:val="BodyText"/>
+              <w:pStyle w:val="Textoindependiente"/>
               <w:jc w:val="left"/>
               <w:rPr>
                 <w:rFonts w:ascii="Times New Roman" w:hAnsi="Times New Roman"/>
@@ -4518,7 +4518,7 @@
           </w:tcPr>
           <w:p>
             <w:pPr>
-              <w:pStyle w:val="BodyText"/>
+              <w:pStyle w:val="Textoindependiente"/>
               <w:jc w:val="left"/>
               <w:rPr>
                 <w:rFonts w:ascii="Times New Roman" w:hAnsi="Times New Roman"/>
@@ -4546,7 +4546,7 @@
           </w:tcPr>
           <w:p>
             <w:pPr>
-              <w:pStyle w:val="BodyText"/>
+              <w:pStyle w:val="Textoindependiente"/>
               <w:jc w:val="left"/>
               <w:rPr>
                 <w:rFonts w:ascii="Times New Roman" w:hAnsi="Times New Roman"/>
@@ -4603,7 +4603,7 @@
           </w:tcPr>
           <w:p>
             <w:pPr>
-              <w:pStyle w:val="BodyText"/>
+              <w:pStyle w:val="Textoindependiente"/>
               <w:jc w:val="left"/>
               <w:rPr>
                 <w:rFonts w:ascii="Times New Roman" w:hAnsi="Times New Roman"/>
@@ -4631,7 +4631,7 @@
           </w:tcPr>
           <w:p>
             <w:pPr>
-              <w:pStyle w:val="BodyText"/>
+              <w:pStyle w:val="Textoindependiente"/>
               <w:jc w:val="left"/>
               <w:rPr>
                 <w:rFonts w:ascii="Times New Roman" w:hAnsi="Times New Roman"/>
@@ -4698,7 +4698,7 @@
           </w:tcPr>
           <w:p>
             <w:pPr>
-              <w:pStyle w:val="BodyText"/>
+              <w:pStyle w:val="Textoindependiente"/>
               <w:jc w:val="left"/>
               <w:rPr>
                 <w:rFonts w:ascii="Times New Roman" w:hAnsi="Times New Roman"/>
@@ -4726,7 +4726,7 @@
           </w:tcPr>
           <w:p>
             <w:pPr>
-              <w:pStyle w:val="BodyText"/>
+              <w:pStyle w:val="Textoindependiente"/>
               <w:jc w:val="left"/>
               <w:rPr>
                 <w:rFonts w:ascii="Times New Roman" w:hAnsi="Times New Roman"/>
@@ -4783,7 +4783,7 @@
           </w:tcPr>
           <w:p>
             <w:pPr>
-              <w:pStyle w:val="BodyText"/>
+              <w:pStyle w:val="Textoindependiente"/>
               <w:jc w:val="left"/>
               <w:rPr>
                 <w:rFonts w:ascii="Times New Roman" w:hAnsi="Times New Roman"/>
@@ -4811,7 +4811,7 @@
           </w:tcPr>
           <w:p>
             <w:pPr>
-              <w:pStyle w:val="BodyText"/>
+              <w:pStyle w:val="Textoindependiente"/>
               <w:jc w:val="left"/>
               <w:rPr>
                 <w:rFonts w:ascii="Times New Roman" w:hAnsi="Times New Roman"/>
@@ -4868,7 +4868,7 @@
           </w:tcPr>
           <w:p>
             <w:pPr>
-              <w:pStyle w:val="BodyText"/>
+              <w:pStyle w:val="Textoindependiente"/>
               <w:jc w:val="left"/>
               <w:rPr>
                 <w:rFonts w:ascii="Times New Roman" w:hAnsi="Times New Roman"/>
@@ -4896,7 +4896,7 @@
           </w:tcPr>
           <w:p>
             <w:pPr>
-              <w:pStyle w:val="BodyText"/>
+              <w:pStyle w:val="Textoindependiente"/>
               <w:jc w:val="left"/>
               <w:rPr>
                 <w:rFonts w:ascii="Times New Roman" w:hAnsi="Times New Roman"/>
@@ -4953,7 +4953,7 @@
           </w:tcPr>
           <w:p>
             <w:pPr>
-              <w:pStyle w:val="BodyText"/>
+              <w:pStyle w:val="Textoindependiente"/>
               <w:jc w:val="left"/>
               <w:rPr>
                 <w:rFonts w:ascii="Times New Roman" w:hAnsi="Times New Roman"/>
@@ -4981,7 +4981,7 @@
           </w:tcPr>
           <w:p>
             <w:pPr>
-              <w:pStyle w:val="BodyText"/>
+              <w:pStyle w:val="Textoindependiente"/>
               <w:jc w:val="left"/>
               <w:rPr>
                 <w:rFonts w:ascii="Times New Roman" w:hAnsi="Times New Roman"/>
@@ -5038,7 +5038,7 @@
           </w:tcPr>
           <w:p>
             <w:pPr>
-              <w:pStyle w:val="BodyText"/>
+              <w:pStyle w:val="Textoindependiente"/>
               <w:jc w:val="left"/>
               <w:rPr>
                 <w:rFonts w:ascii="Times New Roman" w:hAnsi="Times New Roman"/>
@@ -5066,7 +5066,7 @@
           </w:tcPr>
           <w:p>
             <w:pPr>
-              <w:pStyle w:val="BodyText"/>
+              <w:pStyle w:val="Textoindependiente"/>
               <w:jc w:val="left"/>
               <w:rPr>
                 <w:rFonts w:ascii="Times New Roman" w:hAnsi="Times New Roman"/>
@@ -5123,7 +5123,7 @@
           </w:tcPr>
           <w:p>
             <w:pPr>
-              <w:pStyle w:val="BodyText"/>
+              <w:pStyle w:val="Textoindependiente"/>
               <w:jc w:val="left"/>
               <w:rPr>
                 <w:rFonts w:ascii="Times New Roman" w:hAnsi="Times New Roman"/>
@@ -5151,7 +5151,7 @@
           </w:tcPr>
           <w:p>
             <w:pPr>
-              <w:pStyle w:val="BodyText"/>
+              <w:pStyle w:val="Textoindependiente"/>
               <w:jc w:val="left"/>
               <w:rPr>
                 <w:rFonts w:ascii="Times New Roman" w:hAnsi="Times New Roman"/>
@@ -5208,7 +5208,7 @@
           </w:tcPr>
           <w:p>
             <w:pPr>
-              <w:pStyle w:val="BodyText"/>
+              <w:pStyle w:val="Textoindependiente"/>
               <w:jc w:val="left"/>
               <w:rPr>
                 <w:rFonts w:ascii="Times New Roman" w:hAnsi="Times New Roman"/>
@@ -5236,7 +5236,7 @@
           </w:tcPr>
           <w:p>
             <w:pPr>
-              <w:pStyle w:val="BodyText"/>
+              <w:pStyle w:val="Textoindependiente"/>
               <w:jc w:val="left"/>
               <w:rPr>
                 <w:rFonts w:ascii="Times New Roman" w:hAnsi="Times New Roman"/>
@@ -5293,7 +5293,7 @@
           </w:tcPr>
           <w:p>
             <w:pPr>
-              <w:pStyle w:val="BodyText"/>
+              <w:pStyle w:val="Textoindependiente"/>
               <w:jc w:val="left"/>
               <w:rPr>
                 <w:rFonts w:ascii="Times New Roman" w:hAnsi="Times New Roman"/>
@@ -5321,7 +5321,7 @@
           </w:tcPr>
           <w:p>
             <w:pPr>
-              <w:pStyle w:val="BodyText"/>
+              <w:pStyle w:val="Textoindependiente"/>
               <w:jc w:val="left"/>
               <w:rPr>
                 <w:rFonts w:ascii="Times New Roman" w:hAnsi="Times New Roman"/>
@@ -5378,7 +5378,7 @@
           </w:tcPr>
           <w:p>
             <w:pPr>
-              <w:pStyle w:val="BodyText"/>
+              <w:pStyle w:val="Textoindependiente"/>
               <w:jc w:val="left"/>
               <w:rPr>
                 <w:rFonts w:ascii="Times New Roman" w:hAnsi="Times New Roman"/>
@@ -5406,7 +5406,7 @@
           </w:tcPr>
           <w:p>
             <w:pPr>
-              <w:pStyle w:val="BodyText"/>
+              <w:pStyle w:val="Textoindependiente"/>
               <w:jc w:val="left"/>
               <w:rPr>
                 <w:rFonts w:ascii="Times New Roman" w:hAnsi="Times New Roman"/>
@@ -5463,7 +5463,7 @@
           </w:tcPr>
           <w:p>
             <w:pPr>
-              <w:pStyle w:val="BodyText"/>
+              <w:pStyle w:val="Textoindependiente"/>
               <w:jc w:val="left"/>
               <w:rPr>
                 <w:rFonts w:ascii="Times New Roman" w:hAnsi="Times New Roman"/>
@@ -5491,7 +5491,7 @@
           </w:tcPr>
           <w:p>
             <w:pPr>
-              <w:pStyle w:val="BodyText"/>
+              <w:pStyle w:val="Textoindependiente"/>
               <w:jc w:val="left"/>
               <w:rPr>
                 <w:rFonts w:ascii="Times New Roman" w:hAnsi="Times New Roman"/>
@@ -5558,7 +5558,7 @@
           </w:tcPr>
           <w:p>
             <w:pPr>
-              <w:pStyle w:val="BodyText"/>
+              <w:pStyle w:val="Textoindependiente"/>
               <w:jc w:val="left"/>
               <w:rPr>
                 <w:rFonts w:ascii="Times New Roman" w:hAnsi="Times New Roman"/>
@@ -5586,7 +5586,7 @@
           </w:tcPr>
           <w:p>
             <w:pPr>
-              <w:pStyle w:val="BodyText"/>
+              <w:pStyle w:val="Textoindependiente"/>
               <w:jc w:val="left"/>
               <w:rPr>
                 <w:rFonts w:ascii="Times New Roman" w:hAnsi="Times New Roman"/>
@@ -5653,7 +5653,7 @@
           </w:tcPr>
           <w:p>
             <w:pPr>
-              <w:pStyle w:val="BodyText"/>
+              <w:pStyle w:val="Textoindependiente"/>
               <w:jc w:val="left"/>
               <w:rPr>
                 <w:rFonts w:ascii="Times New Roman" w:hAnsi="Times New Roman"/>
@@ -5681,7 +5681,7 @@
           </w:tcPr>
           <w:p>
             <w:pPr>
-              <w:pStyle w:val="BodyText"/>
+              <w:pStyle w:val="Textoindependiente"/>
               <w:jc w:val="left"/>
               <w:rPr>
                 <w:rFonts w:ascii="Times New Roman" w:hAnsi="Times New Roman"/>
@@ -5738,7 +5738,7 @@
           </w:tcPr>
           <w:p>
             <w:pPr>
-              <w:pStyle w:val="BodyText"/>
+              <w:pStyle w:val="Textoindependiente"/>
               <w:jc w:val="left"/>
               <w:rPr>
                 <w:rFonts w:ascii="Times New Roman" w:hAnsi="Times New Roman"/>
@@ -5766,7 +5766,7 @@
           </w:tcPr>
           <w:p>
             <w:pPr>
-              <w:pStyle w:val="BodyText"/>
+              <w:pStyle w:val="Textoindependiente"/>
               <w:jc w:val="left"/>
               <w:rPr>
                 <w:rFonts w:ascii="Times New Roman" w:hAnsi="Times New Roman"/>
@@ -5823,7 +5823,7 @@
           </w:tcPr>
           <w:p>
             <w:pPr>
-              <w:pStyle w:val="BodyText"/>
+              <w:pStyle w:val="Textoindependiente"/>
               <w:jc w:val="left"/>
               <w:rPr>
                 <w:rFonts w:ascii="Times New Roman" w:hAnsi="Times New Roman"/>
@@ -5851,7 +5851,7 @@
           </w:tcPr>
           <w:p>
             <w:pPr>
-              <w:pStyle w:val="BodyText"/>
+              <w:pStyle w:val="Textoindependiente"/>
               <w:jc w:val="left"/>
               <w:rPr>
                 <w:rFonts w:ascii="Times New Roman" w:hAnsi="Times New Roman"/>
@@ -5908,7 +5908,7 @@
           </w:tcPr>
           <w:p>
             <w:pPr>
-              <w:pStyle w:val="BodyText"/>
+              <w:pStyle w:val="Textoindependiente"/>
               <w:jc w:val="left"/>
               <w:rPr>
                 <w:rFonts w:ascii="Times New Roman" w:hAnsi="Times New Roman"/>
@@ -5936,7 +5936,7 @@
           </w:tcPr>
           <w:p>
             <w:pPr>
-              <w:pStyle w:val="BodyText"/>
+              <w:pStyle w:val="Textoindependiente"/>
               <w:jc w:val="left"/>
               <w:rPr>
                 <w:rFonts w:ascii="Times New Roman" w:hAnsi="Times New Roman"/>
@@ -5993,7 +5993,7 @@
           </w:tcPr>
           <w:p>
             <w:pPr>
-              <w:pStyle w:val="BodyText"/>
+              <w:pStyle w:val="Textoindependiente"/>
               <w:jc w:val="left"/>
               <w:rPr>
                 <w:rFonts w:ascii="Times New Roman" w:hAnsi="Times New Roman"/>
@@ -6021,7 +6021,7 @@
           </w:tcPr>
           <w:p>
             <w:pPr>
-              <w:pStyle w:val="BodyText"/>
+              <w:pStyle w:val="Textoindependiente"/>
               <w:jc w:val="left"/>
               <w:rPr>
                 <w:rFonts w:ascii="Times New Roman" w:hAnsi="Times New Roman"/>
@@ -6078,7 +6078,7 @@
           </w:tcPr>
           <w:p>
             <w:pPr>
-              <w:pStyle w:val="BodyText"/>
+              <w:pStyle w:val="Textoindependiente"/>
               <w:jc w:val="left"/>
               <w:rPr>
                 <w:rFonts w:ascii="Times New Roman" w:hAnsi="Times New Roman"/>
@@ -6106,7 +6106,7 @@
           </w:tcPr>
           <w:p>
             <w:pPr>
-              <w:pStyle w:val="BodyText"/>
+              <w:pStyle w:val="Textoindependiente"/>
               <w:jc w:val="left"/>
               <w:rPr>
                 <w:rFonts w:ascii="Times New Roman" w:hAnsi="Times New Roman"/>
@@ -6163,7 +6163,7 @@
           </w:tcPr>
           <w:p>
             <w:pPr>
-              <w:pStyle w:val="BodyText"/>
+              <w:pStyle w:val="Textoindependiente"/>
               <w:jc w:val="left"/>
               <w:rPr>
                 <w:rFonts w:ascii="Times New Roman" w:hAnsi="Times New Roman"/>
@@ -6191,7 +6191,7 @@
           </w:tcPr>
           <w:p>
             <w:pPr>
-              <w:pStyle w:val="BodyText"/>
+              <w:pStyle w:val="Textoindependiente"/>
               <w:jc w:val="left"/>
               <w:rPr>
                 <w:rFonts w:ascii="Times New Roman" w:hAnsi="Times New Roman"/>
@@ -6248,7 +6248,7 @@
           </w:tcPr>
           <w:p>
             <w:pPr>
-              <w:pStyle w:val="BodyText"/>
+              <w:pStyle w:val="Textoindependiente"/>
               <w:jc w:val="left"/>
               <w:rPr>
                 <w:rFonts w:ascii="Times New Roman" w:hAnsi="Times New Roman"/>
@@ -6276,7 +6276,7 @@
           </w:tcPr>
           <w:p>
             <w:pPr>
-              <w:pStyle w:val="BodyText"/>
+              <w:pStyle w:val="Textoindependiente"/>
               <w:jc w:val="left"/>
               <w:rPr>
                 <w:rFonts w:ascii="Times New Roman" w:hAnsi="Times New Roman"/>
@@ -6333,7 +6333,7 @@
           </w:tcPr>
           <w:p>
             <w:pPr>
-              <w:pStyle w:val="BodyText"/>
+              <w:pStyle w:val="Textoindependiente"/>
               <w:jc w:val="left"/>
               <w:rPr>
                 <w:rFonts w:ascii="Times New Roman" w:hAnsi="Times New Roman"/>
@@ -6361,7 +6361,7 @@
           </w:tcPr>
           <w:p>
             <w:pPr>
-              <w:pStyle w:val="BodyText"/>
+              <w:pStyle w:val="Textoindependiente"/>
               <w:jc w:val="left"/>
               <w:rPr>
                 <w:rFonts w:ascii="Times New Roman" w:hAnsi="Times New Roman"/>
@@ -6418,7 +6418,7 @@
           </w:tcPr>
           <w:p>
             <w:pPr>
-              <w:pStyle w:val="BodyText"/>
+              <w:pStyle w:val="Textoindependiente"/>
               <w:jc w:val="left"/>
               <w:rPr>
                 <w:rFonts w:ascii="Times New Roman" w:hAnsi="Times New Roman"/>
@@ -6446,7 +6446,7 @@
           </w:tcPr>
           <w:p>
             <w:pPr>
-              <w:pStyle w:val="BodyText"/>
+              <w:pStyle w:val="Textoindependiente"/>
               <w:jc w:val="left"/>
               <w:rPr>
                 <w:rFonts w:ascii="Times New Roman" w:hAnsi="Times New Roman"/>
@@ -6503,7 +6503,7 @@
           </w:tcPr>
           <w:p>
             <w:pPr>
-              <w:pStyle w:val="BodyText"/>
+              <w:pStyle w:val="Textoindependiente"/>
               <w:jc w:val="left"/>
               <w:rPr>
                 <w:rFonts w:ascii="Times New Roman" w:hAnsi="Times New Roman"/>
@@ -6531,7 +6531,7 @@
           </w:tcPr>
           <w:p>
             <w:pPr>
-              <w:pStyle w:val="BodyText"/>
+              <w:pStyle w:val="Textoindependiente"/>
               <w:jc w:val="left"/>
               <w:rPr>
                 <w:rFonts w:ascii="Times New Roman" w:hAnsi="Times New Roman"/>
@@ -6588,7 +6588,7 @@
           </w:tcPr>
           <w:p>
             <w:pPr>
-              <w:pStyle w:val="BodyText"/>
+              <w:pStyle w:val="Textoindependiente"/>
               <w:jc w:val="left"/>
               <w:rPr>
                 <w:rFonts w:ascii="Times New Roman" w:hAnsi="Times New Roman"/>
@@ -6616,7 +6616,7 @@
           </w:tcPr>
           <w:p>
             <w:pPr>
-              <w:pStyle w:val="BodyText"/>
+              <w:pStyle w:val="Textoindependiente"/>
               <w:jc w:val="left"/>
               <w:rPr>
                 <w:rFonts w:ascii="Times New Roman" w:hAnsi="Times New Roman"/>
@@ -6683,7 +6683,7 @@
           </w:tcPr>
           <w:p>
             <w:pPr>
-              <w:pStyle w:val="BodyText"/>
+              <w:pStyle w:val="Textoindependiente"/>
               <w:jc w:val="left"/>
               <w:rPr>
                 <w:rFonts w:ascii="Times New Roman" w:hAnsi="Times New Roman"/>
@@ -6721,7 +6721,7 @@
           </w:tcPr>
           <w:p>
             <w:pPr>
-              <w:pStyle w:val="BodyText"/>
+              <w:pStyle w:val="Textoindependiente"/>
               <w:jc w:val="left"/>
               <w:rPr>
                 <w:rFonts w:ascii="Times New Roman" w:hAnsi="Times New Roman"/>
@@ -6778,7 +6778,7 @@
           </w:tcPr>
           <w:p>
             <w:pPr>
-              <w:pStyle w:val="BodyText"/>
+              <w:pStyle w:val="Textoindependiente"/>
               <w:jc w:val="left"/>
               <w:rPr>
                 <w:rFonts w:ascii="Times New Roman" w:hAnsi="Times New Roman"/>
@@ -6806,7 +6806,7 @@
           </w:tcPr>
           <w:p>
             <w:pPr>
-              <w:pStyle w:val="BodyText"/>
+              <w:pStyle w:val="Textoindependiente"/>
               <w:jc w:val="left"/>
               <w:rPr>
                 <w:rFonts w:ascii="Times New Roman" w:hAnsi="Times New Roman"/>
@@ -6863,7 +6863,7 @@
           </w:tcPr>
           <w:p>
             <w:pPr>
-              <w:pStyle w:val="BodyText"/>
+              <w:pStyle w:val="Textoindependiente"/>
               <w:jc w:val="left"/>
               <w:rPr>
                 <w:rFonts w:ascii="Times New Roman" w:hAnsi="Times New Roman"/>
@@ -6891,7 +6891,7 @@
           </w:tcPr>
           <w:p>
             <w:pPr>
-              <w:pStyle w:val="BodyText"/>
+              <w:pStyle w:val="Textoindependiente"/>
               <w:jc w:val="left"/>
               <w:rPr>
                 <w:rFonts w:ascii="Times New Roman" w:hAnsi="Times New Roman"/>
@@ -6949,7 +6949,7 @@
           </w:tcPr>
           <w:p>
             <w:pPr>
-              <w:pStyle w:val="BodyText"/>
+              <w:pStyle w:val="Textoindependiente"/>
               <w:jc w:val="left"/>
               <w:rPr>
                 <w:rFonts w:ascii="Times New Roman" w:hAnsi="Times New Roman"/>
@@ -6977,7 +6977,7 @@
           </w:tcPr>
           <w:p>
             <w:pPr>
-              <w:pStyle w:val="BodyText"/>
+              <w:pStyle w:val="Textoindependiente"/>
               <w:jc w:val="left"/>
               <w:rPr>
                 <w:rFonts w:ascii="Times New Roman" w:hAnsi="Times New Roman"/>
@@ -7034,7 +7034,7 @@
           </w:tcPr>
           <w:p>
             <w:pPr>
-              <w:pStyle w:val="BodyText"/>
+              <w:pStyle w:val="Textoindependiente"/>
               <w:jc w:val="left"/>
               <w:rPr>
                 <w:rFonts w:ascii="Times New Roman" w:hAnsi="Times New Roman"/>
@@ -7062,7 +7062,7 @@
           </w:tcPr>
           <w:p>
             <w:pPr>
-              <w:pStyle w:val="BodyText"/>
+              <w:pStyle w:val="Textoindependiente"/>
               <w:jc w:val="left"/>
               <w:rPr>
                 <w:rFonts w:ascii="Times New Roman" w:hAnsi="Times New Roman"/>
@@ -7119,7 +7119,7 @@
           </w:tcPr>
           <w:p>
             <w:pPr>
-              <w:pStyle w:val="BodyText"/>
+              <w:pStyle w:val="Textoindependiente"/>
               <w:jc w:val="left"/>
               <w:rPr>
                 <w:rFonts w:ascii="Times New Roman" w:hAnsi="Times New Roman"/>
@@ -7147,7 +7147,7 @@
           </w:tcPr>
           <w:p>
             <w:pPr>
-              <w:pStyle w:val="BodyText"/>
+              <w:pStyle w:val="Textoindependiente"/>
               <w:jc w:val="left"/>
               <w:rPr>
                 <w:rFonts w:ascii="Times New Roman" w:hAnsi="Times New Roman"/>
@@ -7204,7 +7204,7 @@
           </w:tcPr>
           <w:p>
             <w:pPr>
-              <w:pStyle w:val="BodyText"/>
+              <w:pStyle w:val="Textoindependiente"/>
               <w:jc w:val="left"/>
               <w:rPr>
                 <w:rFonts w:ascii="Times New Roman" w:hAnsi="Times New Roman"/>
@@ -7232,7 +7232,7 @@
           </w:tcPr>
           <w:p>
             <w:pPr>
-              <w:pStyle w:val="BodyText"/>
+              <w:pStyle w:val="Textoindependiente"/>
               <w:jc w:val="left"/>
               <w:rPr>
                 <w:rFonts w:ascii="Times New Roman" w:hAnsi="Times New Roman"/>
@@ -7289,7 +7289,7 @@
           </w:tcPr>
           <w:p>
             <w:pPr>
-              <w:pStyle w:val="BodyText"/>
+              <w:pStyle w:val="Textoindependiente"/>
               <w:jc w:val="left"/>
               <w:rPr>
                 <w:rFonts w:ascii="Times New Roman" w:hAnsi="Times New Roman"/>
@@ -7317,7 +7317,7 @@
           </w:tcPr>
           <w:p>
             <w:pPr>
-              <w:pStyle w:val="BodyText"/>
+              <w:pStyle w:val="Textoindependiente"/>
               <w:jc w:val="left"/>
               <w:rPr>
                 <w:rFonts w:ascii="Times New Roman" w:hAnsi="Times New Roman"/>
@@ -7374,7 +7374,7 @@
           </w:tcPr>
           <w:p>
             <w:pPr>
-              <w:pStyle w:val="BodyText"/>
+              <w:pStyle w:val="Textoindependiente"/>
               <w:jc w:val="left"/>
               <w:rPr>
                 <w:rFonts w:ascii="Times New Roman" w:hAnsi="Times New Roman"/>
@@ -7402,7 +7402,7 @@
           </w:tcPr>
           <w:p>
             <w:pPr>
-              <w:pStyle w:val="BodyText"/>
+              <w:pStyle w:val="Textoindependiente"/>
               <w:jc w:val="left"/>
               <w:rPr>
                 <w:rFonts w:ascii="Times New Roman" w:hAnsi="Times New Roman"/>
@@ -7459,7 +7459,7 @@
           </w:tcPr>
           <w:p>
             <w:pPr>
-              <w:pStyle w:val="BodyText"/>
+              <w:pStyle w:val="Textoindependiente"/>
               <w:jc w:val="left"/>
               <w:rPr>
                 <w:rFonts w:ascii="Times New Roman" w:hAnsi="Times New Roman"/>
@@ -7487,7 +7487,7 @@
           </w:tcPr>
           <w:p>
             <w:pPr>
-              <w:pStyle w:val="BodyText"/>
+              <w:pStyle w:val="Textoindependiente"/>
               <w:jc w:val="left"/>
               <w:rPr>
                 <w:rFonts w:ascii="Times New Roman" w:hAnsi="Times New Roman"/>
@@ -7523,7 +7523,7 @@
     </w:tbl>
     <w:p>
       <w:pPr>
-        <w:pStyle w:val="BodyText"/>
+        <w:pStyle w:val="Textoindependiente"/>
         <w:spacing w:line="360" w:lineRule="auto"/>
         <w:jc w:val="left"/>
         <w:rPr>
@@ -7536,7 +7536,7 @@
     </w:p>
     <w:p>
       <w:pPr>
-        <w:pStyle w:val="BodyText"/>
+        <w:pStyle w:val="Textoindependiente"/>
         <w:numPr>
           <w:ilvl w:val="0"/>
           <w:numId w:val="1"/>
@@ -7659,7 +7659,7 @@
           </w:tcPr>
           <w:p>
             <w:pPr>
-              <w:pStyle w:val="BodyText"/>
+              <w:pStyle w:val="Textoindependiente"/>
               <w:jc w:val="center"/>
               <w:rPr>
                 <w:rFonts w:ascii="Times New Roman" w:hAnsi="Times New Roman"/>
@@ -7708,7 +7708,7 @@
           </w:tcPr>
           <w:p>
             <w:pPr>
-              <w:pStyle w:val="BodyText"/>
+              <w:pStyle w:val="Textoindependiente"/>
               <w:jc w:val="center"/>
               <w:rPr>
                 <w:rFonts w:ascii="Times New Roman" w:hAnsi="Times New Roman"/>
@@ -7737,7 +7737,7 @@
           </w:tcPr>
           <w:p>
             <w:pPr>
-              <w:pStyle w:val="BodyText"/>
+              <w:pStyle w:val="Textoindependiente"/>
               <w:jc w:val="center"/>
               <w:rPr>
                 <w:rFonts w:ascii="Times New Roman" w:hAnsi="Times New Roman"/>
@@ -7766,7 +7766,7 @@
           </w:tcPr>
           <w:p>
             <w:pPr>
-              <w:pStyle w:val="BodyText"/>
+              <w:pStyle w:val="Textoindependiente"/>
               <w:jc w:val="center"/>
               <w:rPr>
                 <w:rFonts w:ascii="Times New Roman" w:hAnsi="Times New Roman"/>
@@ -7828,7 +7828,7 @@
           </w:tcPr>
           <w:p>
             <w:pPr>
-              <w:pStyle w:val="BodyText"/>
+              <w:pStyle w:val="Textoindependiente"/>
               <w:jc w:val="center"/>
               <w:rPr>
                 <w:rFonts w:ascii="Times New Roman" w:hAnsi="Times New Roman"/>
@@ -7857,7 +7857,7 @@
           </w:tcPr>
           <w:p>
             <w:pPr>
-              <w:pStyle w:val="BodyText"/>
+              <w:pStyle w:val="Textoindependiente"/>
               <w:jc w:val="center"/>
               <w:rPr>
                 <w:rFonts w:ascii="Times New Roman" w:hAnsi="Times New Roman"/>
@@ -7876,7 +7876,7 @@
           </w:tcPr>
           <w:p>
             <w:pPr>
-              <w:pStyle w:val="BodyText"/>
+              <w:pStyle w:val="Textoindependiente"/>
               <w:jc w:val="center"/>
               <w:rPr>
                 <w:rFonts w:ascii="Times New Roman" w:hAnsi="Times New Roman"/>
@@ -7942,7 +7942,7 @@
           </w:tcPr>
           <w:p>
             <w:pPr>
-              <w:pStyle w:val="BodyText"/>
+              <w:pStyle w:val="Textoindependiente"/>
               <w:jc w:val="center"/>
               <w:rPr>
                 <w:rFonts w:ascii="Times New Roman" w:hAnsi="Times New Roman"/>
@@ -7971,7 +7971,7 @@
           </w:tcPr>
           <w:p>
             <w:pPr>
-              <w:pStyle w:val="BodyText"/>
+              <w:pStyle w:val="Textoindependiente"/>
               <w:jc w:val="center"/>
               <w:rPr>
                 <w:rFonts w:ascii="Times New Roman" w:hAnsi="Times New Roman"/>
@@ -7990,7 +7990,7 @@
           </w:tcPr>
           <w:p>
             <w:pPr>
-              <w:pStyle w:val="BodyText"/>
+              <w:pStyle w:val="Textoindependiente"/>
               <w:jc w:val="center"/>
               <w:rPr>
                 <w:rFonts w:ascii="Times New Roman" w:hAnsi="Times New Roman"/>
@@ -8038,7 +8038,7 @@
           </w:tcPr>
           <w:p>
             <w:pPr>
-              <w:pStyle w:val="BodyText"/>
+              <w:pStyle w:val="Textoindependiente"/>
               <w:jc w:val="center"/>
               <w:rPr>
                 <w:rFonts w:ascii="Times New Roman" w:hAnsi="Times New Roman"/>
@@ -8067,7 +8067,7 @@
           </w:tcPr>
           <w:p>
             <w:pPr>
-              <w:pStyle w:val="BodyText"/>
+              <w:pStyle w:val="Textoindependiente"/>
               <w:jc w:val="center"/>
               <w:rPr>
                 <w:rFonts w:ascii="Times New Roman" w:hAnsi="Times New Roman"/>
@@ -8086,7 +8086,7 @@
           </w:tcPr>
           <w:p>
             <w:pPr>
-              <w:pStyle w:val="BodyText"/>
+              <w:pStyle w:val="Textoindependiente"/>
               <w:jc w:val="center"/>
               <w:rPr>
                 <w:rFonts w:ascii="Times New Roman" w:hAnsi="Times New Roman"/>
@@ -8134,7 +8134,7 @@
           </w:tcPr>
           <w:p>
             <w:pPr>
-              <w:pStyle w:val="BodyText"/>
+              <w:pStyle w:val="Textoindependiente"/>
               <w:jc w:val="center"/>
               <w:rPr>
                 <w:rFonts w:ascii="Times New Roman" w:hAnsi="Times New Roman"/>
@@ -8163,7 +8163,7 @@
           </w:tcPr>
           <w:p>
             <w:pPr>
-              <w:pStyle w:val="BodyText"/>
+              <w:pStyle w:val="Textoindependiente"/>
               <w:jc w:val="center"/>
               <w:rPr>
                 <w:rFonts w:ascii="Times New Roman" w:hAnsi="Times New Roman"/>
@@ -8182,7 +8182,7 @@
           </w:tcPr>
           <w:p>
             <w:pPr>
-              <w:pStyle w:val="BodyText"/>
+              <w:pStyle w:val="Textoindependiente"/>
               <w:jc w:val="center"/>
               <w:rPr>
                 <w:rFonts w:ascii="Times New Roman" w:hAnsi="Times New Roman"/>
@@ -8230,7 +8230,7 @@
           </w:tcPr>
           <w:p>
             <w:pPr>
-              <w:pStyle w:val="BodyText"/>
+              <w:pStyle w:val="Textoindependiente"/>
               <w:jc w:val="center"/>
               <w:rPr>
                 <w:rFonts w:ascii="Times New Roman" w:hAnsi="Times New Roman"/>
@@ -8259,7 +8259,7 @@
           </w:tcPr>
           <w:p>
             <w:pPr>
-              <w:pStyle w:val="BodyText"/>
+              <w:pStyle w:val="Textoindependiente"/>
               <w:jc w:val="center"/>
               <w:rPr>
                 <w:rFonts w:ascii="Times New Roman" w:hAnsi="Times New Roman"/>
@@ -8278,7 +8278,7 @@
           </w:tcPr>
           <w:p>
             <w:pPr>
-              <w:pStyle w:val="BodyText"/>
+              <w:pStyle w:val="Textoindependiente"/>
               <w:jc w:val="center"/>
               <w:rPr>
                 <w:rFonts w:ascii="Times New Roman" w:hAnsi="Times New Roman"/>
@@ -8326,7 +8326,7 @@
           </w:tcPr>
           <w:p>
             <w:pPr>
-              <w:pStyle w:val="BodyText"/>
+              <w:pStyle w:val="Textoindependiente"/>
               <w:jc w:val="center"/>
               <w:rPr>
                 <w:rFonts w:ascii="Times New Roman" w:hAnsi="Times New Roman"/>
@@ -8345,7 +8345,7 @@
           </w:tcPr>
           <w:p>
             <w:pPr>
-              <w:pStyle w:val="BodyText"/>
+              <w:pStyle w:val="Textoindependiente"/>
               <w:jc w:val="center"/>
               <w:rPr>
                 <w:rFonts w:ascii="Times New Roman" w:hAnsi="Times New Roman"/>
@@ -8374,7 +8374,7 @@
           </w:tcPr>
           <w:p>
             <w:pPr>
-              <w:pStyle w:val="BodyText"/>
+              <w:pStyle w:val="Textoindependiente"/>
               <w:jc w:val="center"/>
               <w:rPr>
                 <w:rFonts w:ascii="Times New Roman" w:hAnsi="Times New Roman"/>
@@ -8422,7 +8422,7 @@
           </w:tcPr>
           <w:p>
             <w:pPr>
-              <w:pStyle w:val="BodyText"/>
+              <w:pStyle w:val="Textoindependiente"/>
               <w:jc w:val="center"/>
               <w:rPr>
                 <w:rFonts w:ascii="Times New Roman" w:hAnsi="Times New Roman"/>
@@ -8451,7 +8451,7 @@
           </w:tcPr>
           <w:p>
             <w:pPr>
-              <w:pStyle w:val="BodyText"/>
+              <w:pStyle w:val="Textoindependiente"/>
               <w:jc w:val="center"/>
               <w:rPr>
                 <w:rFonts w:ascii="Times New Roman" w:hAnsi="Times New Roman"/>
@@ -8470,7 +8470,7 @@
           </w:tcPr>
           <w:p>
             <w:pPr>
-              <w:pStyle w:val="BodyText"/>
+              <w:pStyle w:val="Textoindependiente"/>
               <w:jc w:val="center"/>
               <w:rPr>
                 <w:rFonts w:ascii="Times New Roman" w:hAnsi="Times New Roman"/>
@@ -8518,7 +8518,7 @@
           </w:tcPr>
           <w:p>
             <w:pPr>
-              <w:pStyle w:val="BodyText"/>
+              <w:pStyle w:val="Textoindependiente"/>
               <w:jc w:val="center"/>
               <w:rPr>
                 <w:rFonts w:ascii="Times New Roman" w:hAnsi="Times New Roman"/>
@@ -8537,7 +8537,7 @@
           </w:tcPr>
           <w:p>
             <w:pPr>
-              <w:pStyle w:val="BodyText"/>
+              <w:pStyle w:val="Textoindependiente"/>
               <w:jc w:val="center"/>
               <w:rPr>
                 <w:rFonts w:ascii="Times New Roman" w:hAnsi="Times New Roman"/>
@@ -8566,7 +8566,7 @@
           </w:tcPr>
           <w:p>
             <w:pPr>
-              <w:pStyle w:val="BodyText"/>
+              <w:pStyle w:val="Textoindependiente"/>
               <w:jc w:val="center"/>
               <w:rPr>
                 <w:rFonts w:ascii="Times New Roman" w:hAnsi="Times New Roman"/>
@@ -8582,7 +8582,7 @@
     </w:tbl>
     <w:p>
       <w:pPr>
-        <w:pStyle w:val="BodyText"/>
+        <w:pStyle w:val="Textoindependiente"/>
         <w:spacing w:line="360" w:lineRule="auto"/>
         <w:jc w:val="left"/>
         <w:rPr>
@@ -8596,7 +8596,7 @@
     </w:p>
     <w:p>
       <w:pPr>
-        <w:pStyle w:val="BodyText"/>
+        <w:pStyle w:val="Textoindependiente"/>
         <w:numPr>
           <w:ilvl w:val="0"/>
           <w:numId w:val="1"/>
@@ -8625,7 +8625,7 @@
       </w:r>
       <w:r>
         <w:rPr>
-          <w:rStyle w:val="FootnoteReference"/>
+          <w:rStyle w:val="Refdenotaalpie"/>
           <w:rFonts w:ascii="Times New Roman" w:hAnsi="Times New Roman"/>
           <w:b/>
           <w:sz w:val="20"/>
@@ -8649,7 +8649,7 @@
     </w:p>
     <w:p>
       <w:pPr>
-        <w:pStyle w:val="BodyText"/>
+        <w:pStyle w:val="Textoindependiente"/>
         <w:spacing w:line="360" w:lineRule="auto"/>
         <w:jc w:val="left"/>
         <w:rPr>
@@ -8663,7 +8663,7 @@
     </w:p>
     <w:p>
       <w:pPr>
-        <w:pStyle w:val="BodyText"/>
+        <w:pStyle w:val="Textoindependiente"/>
         <w:jc w:val="left"/>
         <w:rPr>
           <w:rFonts w:ascii="Times New Roman" w:hAnsi="Times New Roman"/>
@@ -8676,7 +8676,7 @@
     </w:p>
     <w:p>
       <w:pPr>
-        <w:pStyle w:val="BodyText"/>
+        <w:pStyle w:val="Textoindependiente"/>
         <w:jc w:val="left"/>
         <w:rPr>
           <w:rFonts w:ascii="Times New Roman" w:hAnsi="Times New Roman"/>
@@ -8689,7 +8689,7 @@
     </w:p>
     <w:p>
       <w:pPr>
-        <w:pStyle w:val="BodyText"/>
+        <w:pStyle w:val="Textoindependiente"/>
         <w:jc w:val="left"/>
         <w:rPr>
           <w:rFonts w:ascii="Times New Roman" w:hAnsi="Times New Roman"/>
@@ -8702,7 +8702,7 @@
     </w:p>
     <w:p>
       <w:pPr>
-        <w:pStyle w:val="BodyText"/>
+        <w:pStyle w:val="Textoindependiente"/>
         <w:jc w:val="left"/>
         <w:rPr>
           <w:rFonts w:ascii="Times New Roman" w:hAnsi="Times New Roman"/>
@@ -8715,7 +8715,7 @@
     </w:p>
     <w:p>
       <w:pPr>
-        <w:pStyle w:val="BodyText"/>
+        <w:pStyle w:val="Textoindependiente"/>
         <w:jc w:val="left"/>
         <w:rPr>
           <w:rFonts w:ascii="Times New Roman" w:hAnsi="Times New Roman"/>
@@ -8728,7 +8728,7 @@
     </w:p>
     <w:p>
       <w:pPr>
-        <w:pStyle w:val="BodyText"/>
+        <w:pStyle w:val="Textoindependiente"/>
         <w:jc w:val="left"/>
         <w:rPr>
           <w:rFonts w:ascii="Times New Roman" w:hAnsi="Times New Roman"/>
@@ -8741,7 +8741,7 @@
     </w:p>
     <w:p>
       <w:pPr>
-        <w:pStyle w:val="BodyText"/>
+        <w:pStyle w:val="Textoindependiente"/>
         <w:jc w:val="left"/>
         <w:rPr>
           <w:rFonts w:ascii="Times New Roman" w:hAnsi="Times New Roman"/>
@@ -8763,7 +8763,7 @@
         <mc:AlternateContent>
           <mc:Choice Requires="wps">
             <w:drawing>
-              <wp:anchor distT="0" distB="0" distL="114300" distR="114300" simplePos="0" relativeHeight="251657216" behindDoc="0" locked="0" layoutInCell="1" allowOverlap="1" wp14:anchorId="0458943B" wp14:editId="588D666B">
+              <wp:anchor distT="0" distB="0" distL="114300" distR="114300" simplePos="0" relativeHeight="251650560" behindDoc="0" locked="0" layoutInCell="1" allowOverlap="1" wp14:anchorId="0458943B" wp14:editId="588D666B">
                 <wp:simplePos x="0" y="0"/>
                 <wp:positionH relativeFrom="column">
                   <wp:posOffset>-134999</wp:posOffset>
@@ -8972,7 +8972,7 @@
               </wp:anchor>
             </w:drawing>
           </mc:Choice>
-          <mc:Fallback>
+          <mc:Fallback xmlns:oel="http://schemas.microsoft.com/office/2019/extlst">
             <w:pict>
               <v:shape w14:anchorId="0458943B" id="Text Box 12" o:spid="_x0000_s1035" type="#_x0000_t202" style="position:absolute;margin-left:-10.65pt;margin-top:14.45pt;width:155.55pt;height:82.9pt;z-index:251657216;visibility:visible;mso-wrap-style:square;mso-width-percent:0;mso-height-percent:0;mso-wrap-distance-left:9pt;mso-wrap-distance-top:0;mso-wrap-distance-right:9pt;mso-wrap-distance-bottom:0;mso-position-horizontal:absolute;mso-position-horizontal-relative:text;mso-position-vertical:absolute;mso-position-vertical-relative:text;mso-width-percent:0;mso-height-percent:0;mso-width-relative:margin;mso-height-relative:margin;v-text-anchor:top" o:gfxdata="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" strokecolor="white [3212]">
                 <v:textbox>
@@ -9133,7 +9133,7 @@
     </w:p>
     <w:p>
       <w:pPr>
-        <w:pStyle w:val="BodyText"/>
+        <w:pStyle w:val="Textoindependiente"/>
         <w:jc w:val="left"/>
         <w:rPr>
           <w:rFonts w:ascii="Times New Roman" w:hAnsi="Times New Roman"/>
@@ -9154,7 +9154,7 @@
         <mc:AlternateContent>
           <mc:Choice Requires="wps">
             <w:drawing>
-              <wp:anchor distT="0" distB="0" distL="114300" distR="114300" simplePos="0" relativeHeight="251659264" behindDoc="0" locked="0" layoutInCell="1" allowOverlap="1" wp14:anchorId="7A0DF40D" wp14:editId="11EC3CB3">
+              <wp:anchor distT="0" distB="0" distL="114300" distR="114300" simplePos="0" relativeHeight="251652608" behindDoc="0" locked="0" layoutInCell="1" allowOverlap="1" wp14:anchorId="7A0DF40D" wp14:editId="11EC3CB3">
                 <wp:simplePos x="0" y="0"/>
                 <wp:positionH relativeFrom="column">
                   <wp:posOffset>3754755</wp:posOffset>
@@ -9339,7 +9339,7 @@
               </wp:anchor>
             </w:drawing>
           </mc:Choice>
-          <mc:Fallback>
+          <mc:Fallback xmlns:oel="http://schemas.microsoft.com/office/2019/extlst">
             <w:pict>
               <v:shape w14:anchorId="7A0DF40D" id="Text Box 10" o:spid="_x0000_s1036" type="#_x0000_t202" style="position:absolute;margin-left:295.65pt;margin-top:4.2pt;width:171.5pt;height:90pt;z-index:251659264;visibility:visible;mso-wrap-style:square;mso-width-percent:0;mso-height-percent:0;mso-wrap-distance-left:9pt;mso-wrap-distance-top:0;mso-wrap-distance-right:9pt;mso-wrap-distance-bottom:0;mso-position-horizontal:absolute;mso-position-horizontal-relative:text;mso-position-vertical:absolute;mso-position-vertical-relative:text;mso-width-percent:0;mso-height-percent:0;mso-width-relative:margin;mso-height-relative:margin;v-text-anchor:top" o:gfxdata="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" strokecolor="white [3212]">
                 <v:textbox>
@@ -9485,7 +9485,7 @@
         <mc:AlternateContent>
           <mc:Choice Requires="wps">
             <w:drawing>
-              <wp:anchor distT="0" distB="0" distL="114300" distR="114300" simplePos="0" relativeHeight="251685888" behindDoc="0" locked="0" layoutInCell="1" allowOverlap="1" wp14:anchorId="553B5880" wp14:editId="61426B82">
+              <wp:anchor distT="0" distB="0" distL="114300" distR="114300" simplePos="0" relativeHeight="251657728" behindDoc="0" locked="0" layoutInCell="1" allowOverlap="1" wp14:anchorId="553B5880" wp14:editId="61426B82">
                 <wp:simplePos x="0" y="0"/>
                 <wp:positionH relativeFrom="column">
                   <wp:posOffset>1716405</wp:posOffset>
@@ -9715,7 +9715,7 @@
               </wp:anchor>
             </w:drawing>
           </mc:Choice>
-          <mc:Fallback>
+          <mc:Fallback xmlns:oel="http://schemas.microsoft.com/office/2019/extlst">
             <w:pict>
               <v:shape w14:anchorId="553B5880" id="Text Box 11" o:spid="_x0000_s1037" type="#_x0000_t202" style="position:absolute;margin-left:135.15pt;margin-top:2.7pt;width:159.75pt;height:67.5pt;z-index:251685888;visibility:visible;mso-wrap-style:square;mso-width-percent:0;mso-height-percent:0;mso-wrap-distance-left:9pt;mso-wrap-distance-top:0;mso-wrap-distance-right:9pt;mso-wrap-distance-bottom:0;mso-position-horizontal:absolute;mso-position-horizontal-relative:text;mso-position-vertical:absolute;mso-position-vertical-relative:text;mso-width-percent:0;mso-height-percent:0;mso-width-relative:margin;mso-height-relative:margin;v-text-anchor:top" o:gfxdata="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" strokecolor="white [3212]">
                 <v:textbox>
@@ -9897,7 +9897,7 @@
     </w:p>
     <w:p>
       <w:pPr>
-        <w:pStyle w:val="BodyText"/>
+        <w:pStyle w:val="Textoindependiente"/>
         <w:jc w:val="left"/>
         <w:rPr>
           <w:rFonts w:ascii="Times New Roman" w:hAnsi="Times New Roman"/>
@@ -9910,7 +9910,7 @@
     </w:p>
     <w:p>
       <w:pPr>
-        <w:pStyle w:val="BodyText"/>
+        <w:pStyle w:val="Textoindependiente"/>
         <w:jc w:val="left"/>
         <w:rPr>
           <w:rFonts w:ascii="Times New Roman" w:hAnsi="Times New Roman"/>
@@ -9931,7 +9931,7 @@
         <mc:AlternateContent>
           <mc:Choice Requires="wps">
             <w:drawing>
-              <wp:anchor distT="4294967292" distB="4294967292" distL="114300" distR="114300" simplePos="0" relativeHeight="251683840" behindDoc="0" locked="0" layoutInCell="1" allowOverlap="1" wp14:anchorId="60BF01C3" wp14:editId="34A3A81C">
+              <wp:anchor distT="4294967292" distB="4294967292" distL="114300" distR="114300" simplePos="0" relativeHeight="251656704" behindDoc="0" locked="0" layoutInCell="1" allowOverlap="1" wp14:anchorId="60BF01C3" wp14:editId="34A3A81C">
                 <wp:simplePos x="0" y="0"/>
                 <wp:positionH relativeFrom="column">
                   <wp:posOffset>-3810</wp:posOffset>
@@ -9988,7 +9988,7 @@
               </wp:anchor>
             </w:drawing>
           </mc:Choice>
-          <mc:Fallback>
+          <mc:Fallback xmlns:oel="http://schemas.microsoft.com/office/2019/extlst">
             <w:pict>
               <v:line w14:anchorId="7711B034" id="3 Conector recto" o:spid="_x0000_s1026" style="position:absolute;z-index:251683840;visibility:visible;mso-wrap-style:square;mso-width-percent:0;mso-height-percent:0;mso-wrap-distance-left:9pt;mso-wrap-distance-top:-1e-4mm;mso-wrap-distance-right:9pt;mso-wrap-distance-bottom:-1e-4mm;mso-position-horizontal:absolute;mso-position-horizontal-relative:text;mso-position-vertical:absolute;mso-position-vertical-relative:text;mso-width-percent:0;mso-height-percent:0;mso-width-relative:page;mso-height-relative:page" from="-.3pt,6pt" to="124.95pt,6pt" o:gfxdata="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" strokecolor="black [3040]">
                 <o:lock v:ext="edit" shapetype="f"/>
@@ -10009,7 +10009,7 @@
         <mc:AlternateContent>
           <mc:Choice Requires="wps">
             <w:drawing>
-              <wp:anchor distT="4294967292" distB="4294967292" distL="114300" distR="114300" simplePos="0" relativeHeight="251686912" behindDoc="0" locked="0" layoutInCell="1" allowOverlap="1" wp14:anchorId="1AB378D3" wp14:editId="201B2868">
+              <wp:anchor distT="4294967292" distB="4294967292" distL="114300" distR="114300" simplePos="0" relativeHeight="251658752" behindDoc="0" locked="0" layoutInCell="1" allowOverlap="1" wp14:anchorId="1AB378D3" wp14:editId="201B2868">
                 <wp:simplePos x="0" y="0"/>
                 <wp:positionH relativeFrom="column">
                   <wp:posOffset>1836420</wp:posOffset>
@@ -10066,7 +10066,7 @@
               </wp:anchor>
             </w:drawing>
           </mc:Choice>
-          <mc:Fallback>
+          <mc:Fallback xmlns:oel="http://schemas.microsoft.com/office/2019/extlst">
             <w:pict>
               <v:line w14:anchorId="1FF6682D" id="5 Conector recto" o:spid="_x0000_s1026" style="position:absolute;z-index:251686912;visibility:visible;mso-wrap-style:square;mso-width-percent:0;mso-height-percent:0;mso-wrap-distance-left:9pt;mso-wrap-distance-top:-1e-4mm;mso-wrap-distance-right:9pt;mso-wrap-distance-bottom:-1e-4mm;mso-position-horizontal:absolute;mso-position-horizontal-relative:text;mso-position-vertical:absolute;mso-position-vertical-relative:text;mso-width-percent:0;mso-height-percent:0;mso-width-relative:page;mso-height-relative:page" from="144.6pt,6pt" to="282.95pt,6pt" o:gfxdata="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" strokecolor="black [3040]">
                 <o:lock v:ext="edit" shapetype="f"/>
@@ -10086,7 +10086,7 @@
         <mc:AlternateContent>
           <mc:Choice Requires="wps">
             <w:drawing>
-              <wp:anchor distT="4294967292" distB="4294967292" distL="114300" distR="114300" simplePos="0" relativeHeight="251689984" behindDoc="0" locked="0" layoutInCell="1" allowOverlap="1" wp14:anchorId="722EE81A" wp14:editId="2D8C3370">
+              <wp:anchor distT="4294967292" distB="4294967292" distL="114300" distR="114300" simplePos="0" relativeHeight="251659776" behindDoc="0" locked="0" layoutInCell="1" allowOverlap="1" wp14:anchorId="722EE81A" wp14:editId="2D8C3370">
                 <wp:simplePos x="0" y="0"/>
                 <wp:positionH relativeFrom="column">
                   <wp:posOffset>3865245</wp:posOffset>
@@ -10143,7 +10143,7 @@
               </wp:anchor>
             </w:drawing>
           </mc:Choice>
-          <mc:Fallback>
+          <mc:Fallback xmlns:oel="http://schemas.microsoft.com/office/2019/extlst">
             <w:pict>
               <v:line w14:anchorId="31F70B4F" id="7 Conector recto" o:spid="_x0000_s1026" style="position:absolute;z-index:251689984;visibility:visible;mso-wrap-style:square;mso-width-percent:0;mso-height-percent:0;mso-wrap-distance-left:9pt;mso-wrap-distance-top:-1e-4mm;mso-wrap-distance-right:9pt;mso-wrap-distance-bottom:-1e-4mm;mso-position-horizontal:absolute;mso-position-horizontal-relative:text;mso-position-vertical:absolute;mso-position-vertical-relative:text;mso-width-percent:0;mso-height-percent:0;mso-width-relative:page;mso-height-relative:page" from="304.35pt,6pt" to="457.2pt,6pt" o:gfxdata="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" strokecolor="black [3040]">
                 <o:lock v:ext="edit" shapetype="f"/>
@@ -10155,7 +10155,7 @@
     </w:p>
     <w:p>
       <w:pPr>
-        <w:pStyle w:val="BodyText"/>
+        <w:pStyle w:val="Textoindependiente"/>
         <w:jc w:val="left"/>
         <w:rPr>
           <w:rFonts w:ascii="Times New Roman" w:hAnsi="Times New Roman"/>
@@ -10168,7 +10168,7 @@
     </w:p>
     <w:p>
       <w:pPr>
-        <w:pStyle w:val="BodyText"/>
+        <w:pStyle w:val="Textoindependiente"/>
         <w:jc w:val="left"/>
         <w:rPr>
           <w:rFonts w:ascii="Times New Roman" w:hAnsi="Times New Roman"/>
@@ -10180,7 +10180,7 @@
     </w:p>
     <w:p>
       <w:pPr>
-        <w:pStyle w:val="BodyText"/>
+        <w:pStyle w:val="Textoindependiente"/>
         <w:jc w:val="left"/>
         <w:rPr>
           <w:rFonts w:ascii="Times New Roman" w:hAnsi="Times New Roman"/>
@@ -10192,7 +10192,7 @@
     </w:p>
     <w:p>
       <w:pPr>
-        <w:pStyle w:val="BodyText"/>
+        <w:pStyle w:val="Textoindependiente"/>
         <w:jc w:val="left"/>
         <w:rPr>
           <w:rFonts w:ascii="Times New Roman" w:hAnsi="Times New Roman"/>
@@ -10250,7 +10250,7 @@
 </file>
 
 <file path=word/endnotes.xml><?xml version="1.0" encoding="utf-8"?>
-<w:endnotes xmlns:wpc="http://schemas.microsoft.com/office/word/2010/wordprocessingCanvas" xmlns:cx="http://schemas.microsoft.com/office/drawing/2014/chartex" xmlns:cx1="http://schemas.microsoft.com/office/drawing/2015/9/8/chartex" xmlns:cx2="http://schemas.microsoft.com/office/drawing/2015/10/21/chartex" xmlns:cx3="http://schemas.microsoft.com/office/drawing/2016/5/9/chartex" xmlns:cx4="http://schemas.microsoft.com/office/drawing/2016/5/10/chartex" xmlns:cx5="http://schemas.microsoft.com/office/drawing/2016/5/11/chartex" xmlns:cx6="http://schemas.microsoft.com/office/drawing/2016/5/12/chartex" xmlns:cx7="http://schemas.microsoft.com/office/drawing/2016/5/13/chartex" xmlns:cx8="http://schemas.microsoft.com/office/drawing/2016/5/14/chartex" xmlns:mc="http://schemas.openxmlformats.org/markup-compatibility/2006" xmlns:aink="http://schemas.microsoft.com/office/drawing/2016/ink" xmlns:am3d="http://schemas.microsoft.com/office/drawing/2017/model3d" xmlns:o="urn:schemas-microsoft-com:office:office" xmlns:oel="http://schemas.microsoft.com/office/2019/extlst" xmlns:r="http://schemas.openxmlformats.org/officeDocument/2006/relationships" xmlns:m="http://schemas.openxmlformats.org/officeDocument/2006/math" xmlns:v="urn:schemas-microsoft-com:vml" xmlns:wp14="http://schemas.microsoft.com/office/word/2010/wordprocessingDrawing" xmlns:wp="http://schemas.openxmlformats.org/drawingml/2006/wordprocessingDrawing" xmlns:w10="urn:schemas-microsoft-com:office:word" xmlns:w="http://schemas.openxmlformats.org/wordprocessingml/2006/main" xmlns:w14="http://schemas.microsoft.com/office/word/2010/wordml" xmlns:w15="http://schemas.microsoft.com/office/word/2012/wordml" xmlns:w16cex="http://schemas.microsoft.com/office/word/2018/wordml/cex" xmlns:w16cid="http://schemas.microsoft.com/office/word/2016/wordml/cid" xmlns:w16="http://schemas.microsoft.com/office/word/2018/wordml" xmlns:w16sdtdh="http://schemas.microsoft.com/office/word/2020/wordml/sdtdatahash" xmlns:w16se="http://schemas.microsoft.com/office/word/2015/wordml/symex" xmlns:wpg="http://schemas.microsoft.com/office/word/2010/wordprocessingGroup" xmlns:wpi="http://schemas.microsoft.com/office/word/2010/wordprocessingInk" xmlns:wne="http://schemas.microsoft.com/office/word/2006/wordml" xmlns:wps="http://schemas.microsoft.com/office/word/2010/wordprocessingShape" mc:Ignorable="w14 w15 w16se w16cid w16 w16cex w16sdtdh wp14">
+<w:endnotes xmlns:wpc="http://schemas.microsoft.com/office/word/2010/wordprocessingCanvas" xmlns:cx="http://schemas.microsoft.com/office/drawing/2014/chartex" xmlns:cx1="http://schemas.microsoft.com/office/drawing/2015/9/8/chartex" xmlns:cx2="http://schemas.microsoft.com/office/drawing/2015/10/21/chartex" xmlns:cx3="http://schemas.microsoft.com/office/drawing/2016/5/9/chartex" xmlns:cx4="http://schemas.microsoft.com/office/drawing/2016/5/10/chartex" xmlns:cx5="http://schemas.microsoft.com/office/drawing/2016/5/11/chartex" xmlns:cx6="http://schemas.microsoft.com/office/drawing/2016/5/12/chartex" xmlns:cx7="http://schemas.microsoft.com/office/drawing/2016/5/13/chartex" xmlns:cx8="http://schemas.microsoft.com/office/drawing/2016/5/14/chartex" xmlns:mc="http://schemas.openxmlformats.org/markup-compatibility/2006" xmlns:aink="http://schemas.microsoft.com/office/drawing/2016/ink" xmlns:am3d="http://schemas.microsoft.com/office/drawing/2017/model3d" xmlns:o="urn:schemas-microsoft-com:office:office" xmlns:r="http://schemas.openxmlformats.org/officeDocument/2006/relationships" xmlns:m="http://schemas.openxmlformats.org/officeDocument/2006/math" xmlns:v="urn:schemas-microsoft-com:vml" xmlns:wp14="http://schemas.microsoft.com/office/word/2010/wordprocessingDrawing" xmlns:wp="http://schemas.openxmlformats.org/drawingml/2006/wordprocessingDrawing" xmlns:w10="urn:schemas-microsoft-com:office:word" xmlns:w="http://schemas.openxmlformats.org/wordprocessingml/2006/main" xmlns:w14="http://schemas.microsoft.com/office/word/2010/wordml" xmlns:w15="http://schemas.microsoft.com/office/word/2012/wordml" xmlns:w16cex="http://schemas.microsoft.com/office/word/2018/wordml/cex" xmlns:w16cid="http://schemas.microsoft.com/office/word/2016/wordml/cid" xmlns:w16="http://schemas.microsoft.com/office/word/2018/wordml" xmlns:w16sdtdh="http://schemas.microsoft.com/office/word/2020/wordml/sdtdatahash" xmlns:w16se="http://schemas.microsoft.com/office/word/2015/wordml/symex" xmlns:wpg="http://schemas.microsoft.com/office/word/2010/wordprocessingGroup" xmlns:wpi="http://schemas.microsoft.com/office/word/2010/wordprocessingInk" xmlns:wne="http://schemas.microsoft.com/office/word/2006/wordml" xmlns:wps="http://schemas.microsoft.com/office/word/2010/wordprocessingShape" mc:Ignorable="w14 w15 w16se w16cid w16 w16cex w16sdtdh wp14">
   <w:endnote w:type="separator" w:id="-1">
     <w:p>
       <w:pPr>
@@ -10275,20 +10275,20 @@
 </file>
 
 <file path=word/footer1.xml><?xml version="1.0" encoding="utf-8"?>
-<w:ftr xmlns:wpc="http://schemas.microsoft.com/office/word/2010/wordprocessingCanvas" xmlns:cx="http://schemas.microsoft.com/office/drawing/2014/chartex" xmlns:cx1="http://schemas.microsoft.com/office/drawing/2015/9/8/chartex" xmlns:cx2="http://schemas.microsoft.com/office/drawing/2015/10/21/chartex" xmlns:cx3="http://schemas.microsoft.com/office/drawing/2016/5/9/chartex" xmlns:cx4="http://schemas.microsoft.com/office/drawing/2016/5/10/chartex" xmlns:cx5="http://schemas.microsoft.com/office/drawing/2016/5/11/chartex" xmlns:cx6="http://schemas.microsoft.com/office/drawing/2016/5/12/chartex" xmlns:cx7="http://schemas.microsoft.com/office/drawing/2016/5/13/chartex" xmlns:cx8="http://schemas.microsoft.com/office/drawing/2016/5/14/chartex" xmlns:mc="http://schemas.openxmlformats.org/markup-compatibility/2006" xmlns:aink="http://schemas.microsoft.com/office/drawing/2016/ink" xmlns:am3d="http://schemas.microsoft.com/office/drawing/2017/model3d" xmlns:o="urn:schemas-microsoft-com:office:office" xmlns:oel="http://schemas.microsoft.com/office/2019/extlst" xmlns:r="http://schemas.openxmlformats.org/officeDocument/2006/relationships" xmlns:m="http://schemas.openxmlformats.org/officeDocument/2006/math" xmlns:v="urn:schemas-microsoft-com:vml" xmlns:wp14="http://schemas.microsoft.com/office/word/2010/wordprocessingDrawing" xmlns:wp="http://schemas.openxmlformats.org/drawingml/2006/wordprocessingDrawing" xmlns:w10="urn:schemas-microsoft-com:office:word" xmlns:w="http://schemas.openxmlformats.org/wordprocessingml/2006/main" xmlns:w14="http://schemas.microsoft.com/office/word/2010/wordml" xmlns:w15="http://schemas.microsoft.com/office/word/2012/wordml" xmlns:w16cex="http://schemas.microsoft.com/office/word/2018/wordml/cex" xmlns:w16cid="http://schemas.microsoft.com/office/word/2016/wordml/cid" xmlns:w16="http://schemas.microsoft.com/office/word/2018/wordml" xmlns:w16sdtdh="http://schemas.microsoft.com/office/word/2020/wordml/sdtdatahash" xmlns:w16se="http://schemas.microsoft.com/office/word/2015/wordml/symex" xmlns:wpg="http://schemas.microsoft.com/office/word/2010/wordprocessingGroup" xmlns:wpi="http://schemas.microsoft.com/office/word/2010/wordprocessingInk" xmlns:wne="http://schemas.microsoft.com/office/word/2006/wordml" xmlns:wps="http://schemas.microsoft.com/office/word/2010/wordprocessingShape" mc:Ignorable="w14 w15 w16se w16cid w16 w16cex w16sdtdh wp14">
+<w:ftr xmlns:wpc="http://schemas.microsoft.com/office/word/2010/wordprocessingCanvas" xmlns:cx="http://schemas.microsoft.com/office/drawing/2014/chartex" xmlns:cx1="http://schemas.microsoft.com/office/drawing/2015/9/8/chartex" xmlns:cx2="http://schemas.microsoft.com/office/drawing/2015/10/21/chartex" xmlns:cx3="http://schemas.microsoft.com/office/drawing/2016/5/9/chartex" xmlns:cx4="http://schemas.microsoft.com/office/drawing/2016/5/10/chartex" xmlns:cx5="http://schemas.microsoft.com/office/drawing/2016/5/11/chartex" xmlns:cx6="http://schemas.microsoft.com/office/drawing/2016/5/12/chartex" xmlns:cx7="http://schemas.microsoft.com/office/drawing/2016/5/13/chartex" xmlns:cx8="http://schemas.microsoft.com/office/drawing/2016/5/14/chartex" xmlns:mc="http://schemas.openxmlformats.org/markup-compatibility/2006" xmlns:aink="http://schemas.microsoft.com/office/drawing/2016/ink" xmlns:am3d="http://schemas.microsoft.com/office/drawing/2017/model3d" xmlns:o="urn:schemas-microsoft-com:office:office" xmlns:r="http://schemas.openxmlformats.org/officeDocument/2006/relationships" xmlns:m="http://schemas.openxmlformats.org/officeDocument/2006/math" xmlns:v="urn:schemas-microsoft-com:vml" xmlns:wp14="http://schemas.microsoft.com/office/word/2010/wordprocessingDrawing" xmlns:wp="http://schemas.openxmlformats.org/drawingml/2006/wordprocessingDrawing" xmlns:w10="urn:schemas-microsoft-com:office:word" xmlns:w="http://schemas.openxmlformats.org/wordprocessingml/2006/main" xmlns:w14="http://schemas.microsoft.com/office/word/2010/wordml" xmlns:w15="http://schemas.microsoft.com/office/word/2012/wordml" xmlns:w16cex="http://schemas.microsoft.com/office/word/2018/wordml/cex" xmlns:w16cid="http://schemas.microsoft.com/office/word/2016/wordml/cid" xmlns:w16="http://schemas.microsoft.com/office/word/2018/wordml" xmlns:w16sdtdh="http://schemas.microsoft.com/office/word/2020/wordml/sdtdatahash" xmlns:w16se="http://schemas.microsoft.com/office/word/2015/wordml/symex" xmlns:wpg="http://schemas.microsoft.com/office/word/2010/wordprocessingGroup" xmlns:wpi="http://schemas.microsoft.com/office/word/2010/wordprocessingInk" xmlns:wne="http://schemas.microsoft.com/office/word/2006/wordml" xmlns:wps="http://schemas.microsoft.com/office/word/2010/wordprocessingShape" mc:Ignorable="w14 w15 w16se w16cid w16 w16cex w16sdtdh wp14">
   <w:p>
     <w:pPr>
-      <w:pStyle w:val="Footer"/>
+      <w:pStyle w:val="Piedepgina"/>
     </w:pPr>
   </w:p>
 </w:ftr>
 </file>
 
 <file path=word/footer2.xml><?xml version="1.0" encoding="utf-8"?>
-<w:ftr xmlns:wpc="http://schemas.microsoft.com/office/word/2010/wordprocessingCanvas" xmlns:cx="http://schemas.microsoft.com/office/drawing/2014/chartex" xmlns:cx1="http://schemas.microsoft.com/office/drawing/2015/9/8/chartex" xmlns:cx2="http://schemas.microsoft.com/office/drawing/2015/10/21/chartex" xmlns:cx3="http://schemas.microsoft.com/office/drawing/2016/5/9/chartex" xmlns:cx4="http://schemas.microsoft.com/office/drawing/2016/5/10/chartex" xmlns:cx5="http://schemas.microsoft.com/office/drawing/2016/5/11/chartex" xmlns:cx6="http://schemas.microsoft.com/office/drawing/2016/5/12/chartex" xmlns:cx7="http://schemas.microsoft.com/office/drawing/2016/5/13/chartex" xmlns:cx8="http://schemas.microsoft.com/office/drawing/2016/5/14/chartex" xmlns:mc="http://schemas.openxmlformats.org/markup-compatibility/2006" xmlns:aink="http://schemas.microsoft.com/office/drawing/2016/ink" xmlns:am3d="http://schemas.microsoft.com/office/drawing/2017/model3d" xmlns:o="urn:schemas-microsoft-com:office:office" xmlns:oel="http://schemas.microsoft.com/office/2019/extlst" xmlns:r="http://schemas.openxmlformats.org/officeDocument/2006/relationships" xmlns:m="http://schemas.openxmlformats.org/officeDocument/2006/math" xmlns:v="urn:schemas-microsoft-com:vml" xmlns:wp14="http://schemas.microsoft.com/office/word/2010/wordprocessingDrawing" xmlns:wp="http://schemas.openxmlformats.org/drawingml/2006/wordprocessingDrawing" xmlns:w10="urn:schemas-microsoft-com:office:word" xmlns:w="http://schemas.openxmlformats.org/wordprocessingml/2006/main" xmlns:w14="http://schemas.microsoft.com/office/word/2010/wordml" xmlns:w15="http://schemas.microsoft.com/office/word/2012/wordml" xmlns:w16cex="http://schemas.microsoft.com/office/word/2018/wordml/cex" xmlns:w16cid="http://schemas.microsoft.com/office/word/2016/wordml/cid" xmlns:w16="http://schemas.microsoft.com/office/word/2018/wordml" xmlns:w16sdtdh="http://schemas.microsoft.com/office/word/2020/wordml/sdtdatahash" xmlns:w16se="http://schemas.microsoft.com/office/word/2015/wordml/symex" xmlns:wpg="http://schemas.microsoft.com/office/word/2010/wordprocessingGroup" xmlns:wpi="http://schemas.microsoft.com/office/word/2010/wordprocessingInk" xmlns:wne="http://schemas.microsoft.com/office/word/2006/wordml" xmlns:wps="http://schemas.microsoft.com/office/word/2010/wordprocessingShape" mc:Ignorable="w14 w15 w16se w16cid w16 w16cex w16sdtdh wp14">
+<w:ftr xmlns:wpc="http://schemas.microsoft.com/office/word/2010/wordprocessingCanvas" xmlns:cx="http://schemas.microsoft.com/office/drawing/2014/chartex" xmlns:cx1="http://schemas.microsoft.com/office/drawing/2015/9/8/chartex" xmlns:cx2="http://schemas.microsoft.com/office/drawing/2015/10/21/chartex" xmlns:cx3="http://schemas.microsoft.com/office/drawing/2016/5/9/chartex" xmlns:cx4="http://schemas.microsoft.com/office/drawing/2016/5/10/chartex" xmlns:cx5="http://schemas.microsoft.com/office/drawing/2016/5/11/chartex" xmlns:cx6="http://schemas.microsoft.com/office/drawing/2016/5/12/chartex" xmlns:cx7="http://schemas.microsoft.com/office/drawing/2016/5/13/chartex" xmlns:cx8="http://schemas.microsoft.com/office/drawing/2016/5/14/chartex" xmlns:mc="http://schemas.openxmlformats.org/markup-compatibility/2006" xmlns:aink="http://schemas.microsoft.com/office/drawing/2016/ink" xmlns:am3d="http://schemas.microsoft.com/office/drawing/2017/model3d" xmlns:o="urn:schemas-microsoft-com:office:office" xmlns:r="http://schemas.openxmlformats.org/officeDocument/2006/relationships" xmlns:m="http://schemas.openxmlformats.org/officeDocument/2006/math" xmlns:v="urn:schemas-microsoft-com:vml" xmlns:wp14="http://schemas.microsoft.com/office/word/2010/wordprocessingDrawing" xmlns:wp="http://schemas.openxmlformats.org/drawingml/2006/wordprocessingDrawing" xmlns:w10="urn:schemas-microsoft-com:office:word" xmlns:w="http://schemas.openxmlformats.org/wordprocessingml/2006/main" xmlns:w14="http://schemas.microsoft.com/office/word/2010/wordml" xmlns:w15="http://schemas.microsoft.com/office/word/2012/wordml" xmlns:w16cex="http://schemas.microsoft.com/office/word/2018/wordml/cex" xmlns:w16cid="http://schemas.microsoft.com/office/word/2016/wordml/cid" xmlns:w16="http://schemas.microsoft.com/office/word/2018/wordml" xmlns:w16sdtdh="http://schemas.microsoft.com/office/word/2020/wordml/sdtdatahash" xmlns:w16se="http://schemas.microsoft.com/office/word/2015/wordml/symex" xmlns:wpg="http://schemas.microsoft.com/office/word/2010/wordprocessingGroup" xmlns:wpi="http://schemas.microsoft.com/office/word/2010/wordprocessingInk" xmlns:wne="http://schemas.microsoft.com/office/word/2006/wordml" xmlns:wps="http://schemas.microsoft.com/office/word/2010/wordprocessingShape" mc:Ignorable="w14 w15 w16se w16cid w16 w16cex w16sdtdh wp14">
   <w:p>
     <w:pPr>
-      <w:pStyle w:val="BodyText"/>
+      <w:pStyle w:val="Textoindependiente"/>
       <w:jc w:val="right"/>
       <w:rPr>
         <w:rFonts w:ascii="Arial" w:hAnsi="Arial" w:cs="Arial"/>
@@ -10335,7 +10335,7 @@
   </w:p>
   <w:p>
     <w:pPr>
-      <w:pStyle w:val="BodyText"/>
+      <w:pStyle w:val="Textoindependiente"/>
       <w:jc w:val="left"/>
       <w:rPr>
         <w:rFonts w:asciiTheme="majorHAnsi" w:hAnsiTheme="majorHAnsi" w:cs="Arial"/>
@@ -10364,7 +10364,7 @@
   </w:p>
   <w:p>
     <w:pPr>
-      <w:pStyle w:val="Footer"/>
+      <w:pStyle w:val="Piedepgina"/>
       <w:tabs>
         <w:tab w:val="clear" w:pos="4252"/>
         <w:tab w:val="clear" w:pos="8504"/>
@@ -10409,7 +10409,7 @@
   </w:p>
   <w:p>
     <w:pPr>
-      <w:pStyle w:val="Footer"/>
+      <w:pStyle w:val="Piedepgina"/>
       <w:ind w:right="360"/>
       <w:rPr>
         <w:rFonts w:ascii="Arial" w:hAnsi="Arial" w:cs="Arial"/>
@@ -10478,17 +10478,17 @@
 </file>
 
 <file path=word/footer3.xml><?xml version="1.0" encoding="utf-8"?>
-<w:ftr xmlns:wpc="http://schemas.microsoft.com/office/word/2010/wordprocessingCanvas" xmlns:cx="http://schemas.microsoft.com/office/drawing/2014/chartex" xmlns:cx1="http://schemas.microsoft.com/office/drawing/2015/9/8/chartex" xmlns:cx2="http://schemas.microsoft.com/office/drawing/2015/10/21/chartex" xmlns:cx3="http://schemas.microsoft.com/office/drawing/2016/5/9/chartex" xmlns:cx4="http://schemas.microsoft.com/office/drawing/2016/5/10/chartex" xmlns:cx5="http://schemas.microsoft.com/office/drawing/2016/5/11/chartex" xmlns:cx6="http://schemas.microsoft.com/office/drawing/2016/5/12/chartex" xmlns:cx7="http://schemas.microsoft.com/office/drawing/2016/5/13/chartex" xmlns:cx8="http://schemas.microsoft.com/office/drawing/2016/5/14/chartex" xmlns:mc="http://schemas.openxmlformats.org/markup-compatibility/2006" xmlns:aink="http://schemas.microsoft.com/office/drawing/2016/ink" xmlns:am3d="http://schemas.microsoft.com/office/drawing/2017/model3d" xmlns:o="urn:schemas-microsoft-com:office:office" xmlns:oel="http://schemas.microsoft.com/office/2019/extlst" xmlns:r="http://schemas.openxmlformats.org/officeDocument/2006/relationships" xmlns:m="http://schemas.openxmlformats.org/officeDocument/2006/math" xmlns:v="urn:schemas-microsoft-com:vml" xmlns:wp14="http://schemas.microsoft.com/office/word/2010/wordprocessingDrawing" xmlns:wp="http://schemas.openxmlformats.org/drawingml/2006/wordprocessingDrawing" xmlns:w10="urn:schemas-microsoft-com:office:word" xmlns:w="http://schemas.openxmlformats.org/wordprocessingml/2006/main" xmlns:w14="http://schemas.microsoft.com/office/word/2010/wordml" xmlns:w15="http://schemas.microsoft.com/office/word/2012/wordml" xmlns:w16cex="http://schemas.microsoft.com/office/word/2018/wordml/cex" xmlns:w16cid="http://schemas.microsoft.com/office/word/2016/wordml/cid" xmlns:w16="http://schemas.microsoft.com/office/word/2018/wordml" xmlns:w16sdtdh="http://schemas.microsoft.com/office/word/2020/wordml/sdtdatahash" xmlns:w16se="http://schemas.microsoft.com/office/word/2015/wordml/symex" xmlns:wpg="http://schemas.microsoft.com/office/word/2010/wordprocessingGroup" xmlns:wpi="http://schemas.microsoft.com/office/word/2010/wordprocessingInk" xmlns:wne="http://schemas.microsoft.com/office/word/2006/wordml" xmlns:wps="http://schemas.microsoft.com/office/word/2010/wordprocessingShape" mc:Ignorable="w14 w15 w16se w16cid w16 w16cex w16sdtdh wp14">
+<w:ftr xmlns:wpc="http://schemas.microsoft.com/office/word/2010/wordprocessingCanvas" xmlns:cx="http://schemas.microsoft.com/office/drawing/2014/chartex" xmlns:cx1="http://schemas.microsoft.com/office/drawing/2015/9/8/chartex" xmlns:cx2="http://schemas.microsoft.com/office/drawing/2015/10/21/chartex" xmlns:cx3="http://schemas.microsoft.com/office/drawing/2016/5/9/chartex" xmlns:cx4="http://schemas.microsoft.com/office/drawing/2016/5/10/chartex" xmlns:cx5="http://schemas.microsoft.com/office/drawing/2016/5/11/chartex" xmlns:cx6="http://schemas.microsoft.com/office/drawing/2016/5/12/chartex" xmlns:cx7="http://schemas.microsoft.com/office/drawing/2016/5/13/chartex" xmlns:cx8="http://schemas.microsoft.com/office/drawing/2016/5/14/chartex" xmlns:mc="http://schemas.openxmlformats.org/markup-compatibility/2006" xmlns:aink="http://schemas.microsoft.com/office/drawing/2016/ink" xmlns:am3d="http://schemas.microsoft.com/office/drawing/2017/model3d" xmlns:o="urn:schemas-microsoft-com:office:office" xmlns:r="http://schemas.openxmlformats.org/officeDocument/2006/relationships" xmlns:m="http://schemas.openxmlformats.org/officeDocument/2006/math" xmlns:v="urn:schemas-microsoft-com:vml" xmlns:wp14="http://schemas.microsoft.com/office/word/2010/wordprocessingDrawing" xmlns:wp="http://schemas.openxmlformats.org/drawingml/2006/wordprocessingDrawing" xmlns:w10="urn:schemas-microsoft-com:office:word" xmlns:w="http://schemas.openxmlformats.org/wordprocessingml/2006/main" xmlns:w14="http://schemas.microsoft.com/office/word/2010/wordml" xmlns:w15="http://schemas.microsoft.com/office/word/2012/wordml" xmlns:w16cex="http://schemas.microsoft.com/office/word/2018/wordml/cex" xmlns:w16cid="http://schemas.microsoft.com/office/word/2016/wordml/cid" xmlns:w16="http://schemas.microsoft.com/office/word/2018/wordml" xmlns:w16sdtdh="http://schemas.microsoft.com/office/word/2020/wordml/sdtdatahash" xmlns:w16se="http://schemas.microsoft.com/office/word/2015/wordml/symex" xmlns:wpg="http://schemas.microsoft.com/office/word/2010/wordprocessingGroup" xmlns:wpi="http://schemas.microsoft.com/office/word/2010/wordprocessingInk" xmlns:wne="http://schemas.microsoft.com/office/word/2006/wordml" xmlns:wps="http://schemas.microsoft.com/office/word/2010/wordprocessingShape" mc:Ignorable="w14 w15 w16se w16cid w16 w16cex w16sdtdh wp14">
   <w:p>
     <w:pPr>
-      <w:pStyle w:val="Footer"/>
+      <w:pStyle w:val="Piedepgina"/>
     </w:pPr>
   </w:p>
 </w:ftr>
 </file>
 
 <file path=word/footnotes.xml><?xml version="1.0" encoding="utf-8"?>
-<w:footnotes xmlns:wpc="http://schemas.microsoft.com/office/word/2010/wordprocessingCanvas" xmlns:cx="http://schemas.microsoft.com/office/drawing/2014/chartex" xmlns:cx1="http://schemas.microsoft.com/office/drawing/2015/9/8/chartex" xmlns:cx2="http://schemas.microsoft.com/office/drawing/2015/10/21/chartex" xmlns:cx3="http://schemas.microsoft.com/office/drawing/2016/5/9/chartex" xmlns:cx4="http://schemas.microsoft.com/office/drawing/2016/5/10/chartex" xmlns:cx5="http://schemas.microsoft.com/office/drawing/2016/5/11/chartex" xmlns:cx6="http://schemas.microsoft.com/office/drawing/2016/5/12/chartex" xmlns:cx7="http://schemas.microsoft.com/office/drawing/2016/5/13/chartex" xmlns:cx8="http://schemas.microsoft.com/office/drawing/2016/5/14/chartex" xmlns:mc="http://schemas.openxmlformats.org/markup-compatibility/2006" xmlns:aink="http://schemas.microsoft.com/office/drawing/2016/ink" xmlns:am3d="http://schemas.microsoft.com/office/drawing/2017/model3d" xmlns:o="urn:schemas-microsoft-com:office:office" xmlns:oel="http://schemas.microsoft.com/office/2019/extlst" xmlns:r="http://schemas.openxmlformats.org/officeDocument/2006/relationships" xmlns:m="http://schemas.openxmlformats.org/officeDocument/2006/math" xmlns:v="urn:schemas-microsoft-com:vml" xmlns:wp14="http://schemas.microsoft.com/office/word/2010/wordprocessingDrawing" xmlns:wp="http://schemas.openxmlformats.org/drawingml/2006/wordprocessingDrawing" xmlns:w10="urn:schemas-microsoft-com:office:word" xmlns:w="http://schemas.openxmlformats.org/wordprocessingml/2006/main" xmlns:w14="http://schemas.microsoft.com/office/word/2010/wordml" xmlns:w15="http://schemas.microsoft.com/office/word/2012/wordml" xmlns:w16cex="http://schemas.microsoft.com/office/word/2018/wordml/cex" xmlns:w16cid="http://schemas.microsoft.com/office/word/2016/wordml/cid" xmlns:w16="http://schemas.microsoft.com/office/word/2018/wordml" xmlns:w16sdtdh="http://schemas.microsoft.com/office/word/2020/wordml/sdtdatahash" xmlns:w16se="http://schemas.microsoft.com/office/word/2015/wordml/symex" xmlns:wpg="http://schemas.microsoft.com/office/word/2010/wordprocessingGroup" xmlns:wpi="http://schemas.microsoft.com/office/word/2010/wordprocessingInk" xmlns:wne="http://schemas.microsoft.com/office/word/2006/wordml" xmlns:wps="http://schemas.microsoft.com/office/word/2010/wordprocessingShape" mc:Ignorable="w14 w15 w16se w16cid w16 w16cex w16sdtdh wp14">
+<w:footnotes xmlns:wpc="http://schemas.microsoft.com/office/word/2010/wordprocessingCanvas" xmlns:cx="http://schemas.microsoft.com/office/drawing/2014/chartex" xmlns:cx1="http://schemas.microsoft.com/office/drawing/2015/9/8/chartex" xmlns:cx2="http://schemas.microsoft.com/office/drawing/2015/10/21/chartex" xmlns:cx3="http://schemas.microsoft.com/office/drawing/2016/5/9/chartex" xmlns:cx4="http://schemas.microsoft.com/office/drawing/2016/5/10/chartex" xmlns:cx5="http://schemas.microsoft.com/office/drawing/2016/5/11/chartex" xmlns:cx6="http://schemas.microsoft.com/office/drawing/2016/5/12/chartex" xmlns:cx7="http://schemas.microsoft.com/office/drawing/2016/5/13/chartex" xmlns:cx8="http://schemas.microsoft.com/office/drawing/2016/5/14/chartex" xmlns:mc="http://schemas.openxmlformats.org/markup-compatibility/2006" xmlns:aink="http://schemas.microsoft.com/office/drawing/2016/ink" xmlns:am3d="http://schemas.microsoft.com/office/drawing/2017/model3d" xmlns:o="urn:schemas-microsoft-com:office:office" xmlns:r="http://schemas.openxmlformats.org/officeDocument/2006/relationships" xmlns:m="http://schemas.openxmlformats.org/officeDocument/2006/math" xmlns:v="urn:schemas-microsoft-com:vml" xmlns:wp14="http://schemas.microsoft.com/office/word/2010/wordprocessingDrawing" xmlns:wp="http://schemas.openxmlformats.org/drawingml/2006/wordprocessingDrawing" xmlns:w10="urn:schemas-microsoft-com:office:word" xmlns:w="http://schemas.openxmlformats.org/wordprocessingml/2006/main" xmlns:w14="http://schemas.microsoft.com/office/word/2010/wordml" xmlns:w15="http://schemas.microsoft.com/office/word/2012/wordml" xmlns:w16cex="http://schemas.microsoft.com/office/word/2018/wordml/cex" xmlns:w16cid="http://schemas.microsoft.com/office/word/2016/wordml/cid" xmlns:w16="http://schemas.microsoft.com/office/word/2018/wordml" xmlns:w16sdtdh="http://schemas.microsoft.com/office/word/2020/wordml/sdtdatahash" xmlns:w16se="http://schemas.microsoft.com/office/word/2015/wordml/symex" xmlns:wpg="http://schemas.microsoft.com/office/word/2010/wordprocessingGroup" xmlns:wpi="http://schemas.microsoft.com/office/word/2010/wordprocessingInk" xmlns:wne="http://schemas.microsoft.com/office/word/2006/wordml" xmlns:wps="http://schemas.microsoft.com/office/word/2010/wordprocessingShape" mc:Ignorable="w14 w15 w16se w16cid w16 w16cex w16sdtdh wp14">
   <w:footnote w:type="separator" w:id="-1">
     <w:p>
       <w:pPr>
@@ -10512,7 +10512,7 @@
   <w:footnote w:id="1">
     <w:p>
       <w:pPr>
-        <w:pStyle w:val="FootnoteText"/>
+        <w:pStyle w:val="Textonotapie"/>
         <w:rPr>
           <w:rFonts w:ascii="Arial" w:hAnsi="Arial" w:cs="Arial"/>
           <w:sz w:val="16"/>
@@ -10521,7 +10521,7 @@
       </w:pPr>
       <w:r>
         <w:rPr>
-          <w:rStyle w:val="FootnoteReference"/>
+          <w:rStyle w:val="Refdenotaalpie"/>
         </w:rPr>
         <w:footnoteRef/>
       </w:r>
@@ -10560,7 +10560,7 @@
     </w:p>
     <w:p>
       <w:pPr>
-        <w:pStyle w:val="FootnoteText"/>
+        <w:pStyle w:val="Textonotapie"/>
         <w:rPr>
           <w:rFonts w:ascii="Arial" w:hAnsi="Arial" w:cs="Arial"/>
           <w:b/>
@@ -10571,14 +10571,14 @@
     </w:p>
     <w:p>
       <w:pPr>
-        <w:pStyle w:val="FootnoteText"/>
+        <w:pStyle w:val="Textonotapie"/>
       </w:pPr>
     </w:p>
   </w:footnote>
   <w:footnote w:id="2">
     <w:p>
       <w:pPr>
-        <w:pStyle w:val="FootnoteText"/>
+        <w:pStyle w:val="Textonotapie"/>
         <w:jc w:val="both"/>
         <w:rPr>
           <w:rFonts w:ascii="Arial" w:hAnsi="Arial" w:cs="Arial"/>
@@ -10591,7 +10591,7 @@
       </w:pPr>
       <w:r>
         <w:rPr>
-          <w:rStyle w:val="FootnoteReference"/>
+          <w:rStyle w:val="Refdenotaalpie"/>
         </w:rPr>
         <w:footnoteRef/>
       </w:r>
@@ -10800,7 +10800,7 @@
     </w:p>
     <w:p>
       <w:pPr>
-        <w:pStyle w:val="FootnoteText"/>
+        <w:pStyle w:val="Textonotapie"/>
       </w:pPr>
     </w:p>
   </w:footnote>
@@ -10808,20 +10808,20 @@
 </file>
 
 <file path=word/header1.xml><?xml version="1.0" encoding="utf-8"?>
-<w:hdr xmlns:wpc="http://schemas.microsoft.com/office/word/2010/wordprocessingCanvas" xmlns:cx="http://schemas.microsoft.com/office/drawing/2014/chartex" xmlns:cx1="http://schemas.microsoft.com/office/drawing/2015/9/8/chartex" xmlns:cx2="http://schemas.microsoft.com/office/drawing/2015/10/21/chartex" xmlns:cx3="http://schemas.microsoft.com/office/drawing/2016/5/9/chartex" xmlns:cx4="http://schemas.microsoft.com/office/drawing/2016/5/10/chartex" xmlns:cx5="http://schemas.microsoft.com/office/drawing/2016/5/11/chartex" xmlns:cx6="http://schemas.microsoft.com/office/drawing/2016/5/12/chartex" xmlns:cx7="http://schemas.microsoft.com/office/drawing/2016/5/13/chartex" xmlns:cx8="http://schemas.microsoft.com/office/drawing/2016/5/14/chartex" xmlns:mc="http://schemas.openxmlformats.org/markup-compatibility/2006" xmlns:aink="http://schemas.microsoft.com/office/drawing/2016/ink" xmlns:am3d="http://schemas.microsoft.com/office/drawing/2017/model3d" xmlns:o="urn:schemas-microsoft-com:office:office" xmlns:oel="http://schemas.microsoft.com/office/2019/extlst" xmlns:r="http://schemas.openxmlformats.org/officeDocument/2006/relationships" xmlns:m="http://schemas.openxmlformats.org/officeDocument/2006/math" xmlns:v="urn:schemas-microsoft-com:vml" xmlns:wp14="http://schemas.microsoft.com/office/word/2010/wordprocessingDrawing" xmlns:wp="http://schemas.openxmlformats.org/drawingml/2006/wordprocessingDrawing" xmlns:w10="urn:schemas-microsoft-com:office:word" xmlns:w="http://schemas.openxmlformats.org/wordprocessingml/2006/main" xmlns:w14="http://schemas.microsoft.com/office/word/2010/wordml" xmlns:w15="http://schemas.microsoft.com/office/word/2012/wordml" xmlns:w16cex="http://schemas.microsoft.com/office/word/2018/wordml/cex" xmlns:w16cid="http://schemas.microsoft.com/office/word/2016/wordml/cid" xmlns:w16="http://schemas.microsoft.com/office/word/2018/wordml" xmlns:w16sdtdh="http://schemas.microsoft.com/office/word/2020/wordml/sdtdatahash" xmlns:w16se="http://schemas.microsoft.com/office/word/2015/wordml/symex" xmlns:wpg="http://schemas.microsoft.com/office/word/2010/wordprocessingGroup" xmlns:wpi="http://schemas.microsoft.com/office/word/2010/wordprocessingInk" xmlns:wne="http://schemas.microsoft.com/office/word/2006/wordml" xmlns:wps="http://schemas.microsoft.com/office/word/2010/wordprocessingShape" mc:Ignorable="w14 w15 w16se w16cid w16 w16cex w16sdtdh wp14">
+<w:hdr xmlns:wpc="http://schemas.microsoft.com/office/word/2010/wordprocessingCanvas" xmlns:cx="http://schemas.microsoft.com/office/drawing/2014/chartex" xmlns:cx1="http://schemas.microsoft.com/office/drawing/2015/9/8/chartex" xmlns:cx2="http://schemas.microsoft.com/office/drawing/2015/10/21/chartex" xmlns:cx3="http://schemas.microsoft.com/office/drawing/2016/5/9/chartex" xmlns:cx4="http://schemas.microsoft.com/office/drawing/2016/5/10/chartex" xmlns:cx5="http://schemas.microsoft.com/office/drawing/2016/5/11/chartex" xmlns:cx6="http://schemas.microsoft.com/office/drawing/2016/5/12/chartex" xmlns:cx7="http://schemas.microsoft.com/office/drawing/2016/5/13/chartex" xmlns:cx8="http://schemas.microsoft.com/office/drawing/2016/5/14/chartex" xmlns:mc="http://schemas.openxmlformats.org/markup-compatibility/2006" xmlns:aink="http://schemas.microsoft.com/office/drawing/2016/ink" xmlns:am3d="http://schemas.microsoft.com/office/drawing/2017/model3d" xmlns:o="urn:schemas-microsoft-com:office:office" xmlns:r="http://schemas.openxmlformats.org/officeDocument/2006/relationships" xmlns:m="http://schemas.openxmlformats.org/officeDocument/2006/math" xmlns:v="urn:schemas-microsoft-com:vml" xmlns:wp14="http://schemas.microsoft.com/office/word/2010/wordprocessingDrawing" xmlns:wp="http://schemas.openxmlformats.org/drawingml/2006/wordprocessingDrawing" xmlns:w10="urn:schemas-microsoft-com:office:word" xmlns:w="http://schemas.openxmlformats.org/wordprocessingml/2006/main" xmlns:w14="http://schemas.microsoft.com/office/word/2010/wordml" xmlns:w15="http://schemas.microsoft.com/office/word/2012/wordml" xmlns:w16cex="http://schemas.microsoft.com/office/word/2018/wordml/cex" xmlns:w16cid="http://schemas.microsoft.com/office/word/2016/wordml/cid" xmlns:w16="http://schemas.microsoft.com/office/word/2018/wordml" xmlns:w16sdtdh="http://schemas.microsoft.com/office/word/2020/wordml/sdtdatahash" xmlns:w16se="http://schemas.microsoft.com/office/word/2015/wordml/symex" xmlns:wpg="http://schemas.microsoft.com/office/word/2010/wordprocessingGroup" xmlns:wpi="http://schemas.microsoft.com/office/word/2010/wordprocessingInk" xmlns:wne="http://schemas.microsoft.com/office/word/2006/wordml" xmlns:wps="http://schemas.microsoft.com/office/word/2010/wordprocessingShape" mc:Ignorable="w14 w15 w16se w16cid w16 w16cex w16sdtdh wp14">
   <w:p>
     <w:pPr>
-      <w:pStyle w:val="Header"/>
+      <w:pStyle w:val="Encabezado"/>
     </w:pPr>
   </w:p>
 </w:hdr>
 </file>
 
 <file path=word/header2.xml><?xml version="1.0" encoding="utf-8"?>
-<w:hdr xmlns:wpc="http://schemas.microsoft.com/office/word/2010/wordprocessingCanvas" xmlns:cx="http://schemas.microsoft.com/office/drawing/2014/chartex" xmlns:cx1="http://schemas.microsoft.com/office/drawing/2015/9/8/chartex" xmlns:cx2="http://schemas.microsoft.com/office/drawing/2015/10/21/chartex" xmlns:cx3="http://schemas.microsoft.com/office/drawing/2016/5/9/chartex" xmlns:cx4="http://schemas.microsoft.com/office/drawing/2016/5/10/chartex" xmlns:cx5="http://schemas.microsoft.com/office/drawing/2016/5/11/chartex" xmlns:cx6="http://schemas.microsoft.com/office/drawing/2016/5/12/chartex" xmlns:cx7="http://schemas.microsoft.com/office/drawing/2016/5/13/chartex" xmlns:cx8="http://schemas.microsoft.com/office/drawing/2016/5/14/chartex" xmlns:mc="http://schemas.openxmlformats.org/markup-compatibility/2006" xmlns:aink="http://schemas.microsoft.com/office/drawing/2016/ink" xmlns:am3d="http://schemas.microsoft.com/office/drawing/2017/model3d" xmlns:o="urn:schemas-microsoft-com:office:office" xmlns:oel="http://schemas.microsoft.com/office/2019/extlst" xmlns:r="http://schemas.openxmlformats.org/officeDocument/2006/relationships" xmlns:m="http://schemas.openxmlformats.org/officeDocument/2006/math" xmlns:v="urn:schemas-microsoft-com:vml" xmlns:wp14="http://schemas.microsoft.com/office/word/2010/wordprocessingDrawing" xmlns:wp="http://schemas.openxmlformats.org/drawingml/2006/wordprocessingDrawing" xmlns:w10="urn:schemas-microsoft-com:office:word" xmlns:w="http://schemas.openxmlformats.org/wordprocessingml/2006/main" xmlns:w14="http://schemas.microsoft.com/office/word/2010/wordml" xmlns:w15="http://schemas.microsoft.com/office/word/2012/wordml" xmlns:w16cex="http://schemas.microsoft.com/office/word/2018/wordml/cex" xmlns:w16cid="http://schemas.microsoft.com/office/word/2016/wordml/cid" xmlns:w16="http://schemas.microsoft.com/office/word/2018/wordml" xmlns:w16sdtdh="http://schemas.microsoft.com/office/word/2020/wordml/sdtdatahash" xmlns:w16se="http://schemas.microsoft.com/office/word/2015/wordml/symex" xmlns:wpg="http://schemas.microsoft.com/office/word/2010/wordprocessingGroup" xmlns:wpi="http://schemas.microsoft.com/office/word/2010/wordprocessingInk" xmlns:wne="http://schemas.microsoft.com/office/word/2006/wordml" xmlns:wps="http://schemas.microsoft.com/office/word/2010/wordprocessingShape" mc:Ignorable="w14 w15 w16se w16cid w16 w16cex w16sdtdh wp14">
+<w:hdr xmlns:wpc="http://schemas.microsoft.com/office/word/2010/wordprocessingCanvas" xmlns:cx="http://schemas.microsoft.com/office/drawing/2014/chartex" xmlns:cx1="http://schemas.microsoft.com/office/drawing/2015/9/8/chartex" xmlns:cx2="http://schemas.microsoft.com/office/drawing/2015/10/21/chartex" xmlns:cx3="http://schemas.microsoft.com/office/drawing/2016/5/9/chartex" xmlns:cx4="http://schemas.microsoft.com/office/drawing/2016/5/10/chartex" xmlns:cx5="http://schemas.microsoft.com/office/drawing/2016/5/11/chartex" xmlns:cx6="http://schemas.microsoft.com/office/drawing/2016/5/12/chartex" xmlns:cx7="http://schemas.microsoft.com/office/drawing/2016/5/13/chartex" xmlns:cx8="http://schemas.microsoft.com/office/drawing/2016/5/14/chartex" xmlns:mc="http://schemas.openxmlformats.org/markup-compatibility/2006" xmlns:aink="http://schemas.microsoft.com/office/drawing/2016/ink" xmlns:am3d="http://schemas.microsoft.com/office/drawing/2017/model3d" xmlns:o="urn:schemas-microsoft-com:office:office" xmlns:r="http://schemas.openxmlformats.org/officeDocument/2006/relationships" xmlns:m="http://schemas.openxmlformats.org/officeDocument/2006/math" xmlns:v="urn:schemas-microsoft-com:vml" xmlns:wp14="http://schemas.microsoft.com/office/word/2010/wordprocessingDrawing" xmlns:wp="http://schemas.openxmlformats.org/drawingml/2006/wordprocessingDrawing" xmlns:w10="urn:schemas-microsoft-com:office:word" xmlns:w="http://schemas.openxmlformats.org/wordprocessingml/2006/main" xmlns:w14="http://schemas.microsoft.com/office/word/2010/wordml" xmlns:w15="http://schemas.microsoft.com/office/word/2012/wordml" xmlns:w16cex="http://schemas.microsoft.com/office/word/2018/wordml/cex" xmlns:w16cid="http://schemas.microsoft.com/office/word/2016/wordml/cid" xmlns:w16="http://schemas.microsoft.com/office/word/2018/wordml" xmlns:w16sdtdh="http://schemas.microsoft.com/office/word/2020/wordml/sdtdatahash" xmlns:w16se="http://schemas.microsoft.com/office/word/2015/wordml/symex" xmlns:wpg="http://schemas.microsoft.com/office/word/2010/wordprocessingGroup" xmlns:wpi="http://schemas.microsoft.com/office/word/2010/wordprocessingInk" xmlns:wne="http://schemas.microsoft.com/office/word/2006/wordml" xmlns:wps="http://schemas.microsoft.com/office/word/2010/wordprocessingShape" mc:Ignorable="w14 w15 w16se w16cid w16 w16cex w16sdtdh wp14">
   <w:p>
     <w:pPr>
-      <w:pStyle w:val="Header"/>
+      <w:pStyle w:val="Encabezado"/>
     </w:pPr>
     <w:r>
       <w:rPr>
@@ -10880,7 +10880,7 @@
   </w:p>
   <w:p>
     <w:pPr>
-      <w:pStyle w:val="Header"/>
+      <w:pStyle w:val="Encabezado"/>
       <w:jc w:val="right"/>
     </w:pPr>
   </w:p>
@@ -10888,17 +10888,17 @@
 </file>
 
 <file path=word/header3.xml><?xml version="1.0" encoding="utf-8"?>
-<w:hdr xmlns:wpc="http://schemas.microsoft.com/office/word/2010/wordprocessingCanvas" xmlns:cx="http://schemas.microsoft.com/office/drawing/2014/chartex" xmlns:cx1="http://schemas.microsoft.com/office/drawing/2015/9/8/chartex" xmlns:cx2="http://schemas.microsoft.com/office/drawing/2015/10/21/chartex" xmlns:cx3="http://schemas.microsoft.com/office/drawing/2016/5/9/chartex" xmlns:cx4="http://schemas.microsoft.com/office/drawing/2016/5/10/chartex" xmlns:cx5="http://schemas.microsoft.com/office/drawing/2016/5/11/chartex" xmlns:cx6="http://schemas.microsoft.com/office/drawing/2016/5/12/chartex" xmlns:cx7="http://schemas.microsoft.com/office/drawing/2016/5/13/chartex" xmlns:cx8="http://schemas.microsoft.com/office/drawing/2016/5/14/chartex" xmlns:mc="http://schemas.openxmlformats.org/markup-compatibility/2006" xmlns:aink="http://schemas.microsoft.com/office/drawing/2016/ink" xmlns:am3d="http://schemas.microsoft.com/office/drawing/2017/model3d" xmlns:o="urn:schemas-microsoft-com:office:office" xmlns:oel="http://schemas.microsoft.com/office/2019/extlst" xmlns:r="http://schemas.openxmlformats.org/officeDocument/2006/relationships" xmlns:m="http://schemas.openxmlformats.org/officeDocument/2006/math" xmlns:v="urn:schemas-microsoft-com:vml" xmlns:wp14="http://schemas.microsoft.com/office/word/2010/wordprocessingDrawing" xmlns:wp="http://schemas.openxmlformats.org/drawingml/2006/wordprocessingDrawing" xmlns:w10="urn:schemas-microsoft-com:office:word" xmlns:w="http://schemas.openxmlformats.org/wordprocessingml/2006/main" xmlns:w14="http://schemas.microsoft.com/office/word/2010/wordml" xmlns:w15="http://schemas.microsoft.com/office/word/2012/wordml" xmlns:w16cex="http://schemas.microsoft.com/office/word/2018/wordml/cex" xmlns:w16cid="http://schemas.microsoft.com/office/word/2016/wordml/cid" xmlns:w16="http://schemas.microsoft.com/office/word/2018/wordml" xmlns:w16sdtdh="http://schemas.microsoft.com/office/word/2020/wordml/sdtdatahash" xmlns:w16se="http://schemas.microsoft.com/office/word/2015/wordml/symex" xmlns:wpg="http://schemas.microsoft.com/office/word/2010/wordprocessingGroup" xmlns:wpi="http://schemas.microsoft.com/office/word/2010/wordprocessingInk" xmlns:wne="http://schemas.microsoft.com/office/word/2006/wordml" xmlns:wps="http://schemas.microsoft.com/office/word/2010/wordprocessingShape" mc:Ignorable="w14 w15 w16se w16cid w16 w16cex w16sdtdh wp14">
+<w:hdr xmlns:wpc="http://schemas.microsoft.com/office/word/2010/wordprocessingCanvas" xmlns:cx="http://schemas.microsoft.com/office/drawing/2014/chartex" xmlns:cx1="http://schemas.microsoft.com/office/drawing/2015/9/8/chartex" xmlns:cx2="http://schemas.microsoft.com/office/drawing/2015/10/21/chartex" xmlns:cx3="http://schemas.microsoft.com/office/drawing/2016/5/9/chartex" xmlns:cx4="http://schemas.microsoft.com/office/drawing/2016/5/10/chartex" xmlns:cx5="http://schemas.microsoft.com/office/drawing/2016/5/11/chartex" xmlns:cx6="http://schemas.microsoft.com/office/drawing/2016/5/12/chartex" xmlns:cx7="http://schemas.microsoft.com/office/drawing/2016/5/13/chartex" xmlns:cx8="http://schemas.microsoft.com/office/drawing/2016/5/14/chartex" xmlns:mc="http://schemas.openxmlformats.org/markup-compatibility/2006" xmlns:aink="http://schemas.microsoft.com/office/drawing/2016/ink" xmlns:am3d="http://schemas.microsoft.com/office/drawing/2017/model3d" xmlns:o="urn:schemas-microsoft-com:office:office" xmlns:r="http://schemas.openxmlformats.org/officeDocument/2006/relationships" xmlns:m="http://schemas.openxmlformats.org/officeDocument/2006/math" xmlns:v="urn:schemas-microsoft-com:vml" xmlns:wp14="http://schemas.microsoft.com/office/word/2010/wordprocessingDrawing" xmlns:wp="http://schemas.openxmlformats.org/drawingml/2006/wordprocessingDrawing" xmlns:w10="urn:schemas-microsoft-com:office:word" xmlns:w="http://schemas.openxmlformats.org/wordprocessingml/2006/main" xmlns:w14="http://schemas.microsoft.com/office/word/2010/wordml" xmlns:w15="http://schemas.microsoft.com/office/word/2012/wordml" xmlns:w16cex="http://schemas.microsoft.com/office/word/2018/wordml/cex" xmlns:w16cid="http://schemas.microsoft.com/office/word/2016/wordml/cid" xmlns:w16="http://schemas.microsoft.com/office/word/2018/wordml" xmlns:w16sdtdh="http://schemas.microsoft.com/office/word/2020/wordml/sdtdatahash" xmlns:w16se="http://schemas.microsoft.com/office/word/2015/wordml/symex" xmlns:wpg="http://schemas.microsoft.com/office/word/2010/wordprocessingGroup" xmlns:wpi="http://schemas.microsoft.com/office/word/2010/wordprocessingInk" xmlns:wne="http://schemas.microsoft.com/office/word/2006/wordml" xmlns:wps="http://schemas.microsoft.com/office/word/2010/wordprocessingShape" mc:Ignorable="w14 w15 w16se w16cid w16 w16cex w16sdtdh wp14">
   <w:p>
     <w:pPr>
-      <w:pStyle w:val="Header"/>
+      <w:pStyle w:val="Encabezado"/>
     </w:pPr>
   </w:p>
 </w:hdr>
 </file>
 
 <file path=word/numbering.xml><?xml version="1.0" encoding="utf-8"?>
-<w:numbering xmlns:wpc="http://schemas.microsoft.com/office/word/2010/wordprocessingCanvas" xmlns:cx="http://schemas.microsoft.com/office/drawing/2014/chartex" xmlns:cx1="http://schemas.microsoft.com/office/drawing/2015/9/8/chartex" xmlns:cx2="http://schemas.microsoft.com/office/drawing/2015/10/21/chartex" xmlns:cx3="http://schemas.microsoft.com/office/drawing/2016/5/9/chartex" xmlns:cx4="http://schemas.microsoft.com/office/drawing/2016/5/10/chartex" xmlns:cx5="http://schemas.microsoft.com/office/drawing/2016/5/11/chartex" xmlns:cx6="http://schemas.microsoft.com/office/drawing/2016/5/12/chartex" xmlns:cx7="http://schemas.microsoft.com/office/drawing/2016/5/13/chartex" xmlns:cx8="http://schemas.microsoft.com/office/drawing/2016/5/14/chartex" xmlns:mc="http://schemas.openxmlformats.org/markup-compatibility/2006" xmlns:aink="http://schemas.microsoft.com/office/drawing/2016/ink" xmlns:am3d="http://schemas.microsoft.com/office/drawing/2017/model3d" xmlns:o="urn:schemas-microsoft-com:office:office" xmlns:oel="http://schemas.microsoft.com/office/2019/extlst" xmlns:r="http://schemas.openxmlformats.org/officeDocument/2006/relationships" xmlns:m="http://schemas.openxmlformats.org/officeDocument/2006/math" xmlns:v="urn:schemas-microsoft-com:vml" xmlns:wp14="http://schemas.microsoft.com/office/word/2010/wordprocessingDrawing" xmlns:wp="http://schemas.openxmlformats.org/drawingml/2006/wordprocessingDrawing" xmlns:w10="urn:schemas-microsoft-com:office:word" xmlns:w="http://schemas.openxmlformats.org/wordprocessingml/2006/main" xmlns:w14="http://schemas.microsoft.com/office/word/2010/wordml" xmlns:w15="http://schemas.microsoft.com/office/word/2012/wordml" xmlns:w16cex="http://schemas.microsoft.com/office/word/2018/wordml/cex" xmlns:w16cid="http://schemas.microsoft.com/office/word/2016/wordml/cid" xmlns:w16="http://schemas.microsoft.com/office/word/2018/wordml" xmlns:w16sdtdh="http://schemas.microsoft.com/office/word/2020/wordml/sdtdatahash" xmlns:w16se="http://schemas.microsoft.com/office/word/2015/wordml/symex" xmlns:wpg="http://schemas.microsoft.com/office/word/2010/wordprocessingGroup" xmlns:wpi="http://schemas.microsoft.com/office/word/2010/wordprocessingInk" xmlns:wne="http://schemas.microsoft.com/office/word/2006/wordml" xmlns:wps="http://schemas.microsoft.com/office/word/2010/wordprocessingShape" mc:Ignorable="w14 w15 w16se w16cid w16 w16cex w16sdtdh wp14">
+<w:numbering xmlns:wpc="http://schemas.microsoft.com/office/word/2010/wordprocessingCanvas" xmlns:cx="http://schemas.microsoft.com/office/drawing/2014/chartex" xmlns:cx1="http://schemas.microsoft.com/office/drawing/2015/9/8/chartex" xmlns:cx2="http://schemas.microsoft.com/office/drawing/2015/10/21/chartex" xmlns:cx3="http://schemas.microsoft.com/office/drawing/2016/5/9/chartex" xmlns:cx4="http://schemas.microsoft.com/office/drawing/2016/5/10/chartex" xmlns:cx5="http://schemas.microsoft.com/office/drawing/2016/5/11/chartex" xmlns:cx6="http://schemas.microsoft.com/office/drawing/2016/5/12/chartex" xmlns:cx7="http://schemas.microsoft.com/office/drawing/2016/5/13/chartex" xmlns:cx8="http://schemas.microsoft.com/office/drawing/2016/5/14/chartex" xmlns:mc="http://schemas.openxmlformats.org/markup-compatibility/2006" xmlns:aink="http://schemas.microsoft.com/office/drawing/2016/ink" xmlns:am3d="http://schemas.microsoft.com/office/drawing/2017/model3d" xmlns:o="urn:schemas-microsoft-com:office:office" xmlns:r="http://schemas.openxmlformats.org/officeDocument/2006/relationships" xmlns:m="http://schemas.openxmlformats.org/officeDocument/2006/math" xmlns:v="urn:schemas-microsoft-com:vml" xmlns:wp14="http://schemas.microsoft.com/office/word/2010/wordprocessingDrawing" xmlns:wp="http://schemas.openxmlformats.org/drawingml/2006/wordprocessingDrawing" xmlns:w10="urn:schemas-microsoft-com:office:word" xmlns:w="http://schemas.openxmlformats.org/wordprocessingml/2006/main" xmlns:w14="http://schemas.microsoft.com/office/word/2010/wordml" xmlns:w15="http://schemas.microsoft.com/office/word/2012/wordml" xmlns:w16cex="http://schemas.microsoft.com/office/word/2018/wordml/cex" xmlns:w16cid="http://schemas.microsoft.com/office/word/2016/wordml/cid" xmlns:w16="http://schemas.microsoft.com/office/word/2018/wordml" xmlns:w16sdtdh="http://schemas.microsoft.com/office/word/2020/wordml/sdtdatahash" xmlns:w16se="http://schemas.microsoft.com/office/word/2015/wordml/symex" xmlns:wpg="http://schemas.microsoft.com/office/word/2010/wordprocessingGroup" xmlns:wpi="http://schemas.microsoft.com/office/word/2010/wordprocessingInk" xmlns:wne="http://schemas.microsoft.com/office/word/2006/wordml" xmlns:wps="http://schemas.microsoft.com/office/word/2010/wordprocessingShape" mc:Ignorable="w14 w15 w16se w16cid w16 w16cex w16sdtdh wp14">
   <w:abstractNum w:abstractNumId="0" w15:restartNumberingAfterBreak="0">
     <w:nsid w:val="3BC83511"/>
     <w:multiLevelType w:val="hybridMultilevel"/>
@@ -11116,10 +11116,10 @@
       </w:rPr>
     </w:lvl>
   </w:abstractNum>
-  <w:num w:numId="1" w16cid:durableId="1760443636">
+  <w:num w:numId="1">
     <w:abstractNumId w:val="1"/>
   </w:num>
-  <w:num w:numId="2" w16cid:durableId="221065338">
+  <w:num w:numId="2">
     <w:abstractNumId w:val="0"/>
   </w:num>
 </w:numbering>
@@ -11524,13 +11524,13 @@
     <w:name w:val="Normal"/>
     <w:qFormat/>
   </w:style>
-  <w:style w:type="character" w:default="1" w:styleId="DefaultParagraphFont">
+  <w:style w:type="character" w:default="1" w:styleId="Fuentedeprrafopredeter">
     <w:name w:val="Default Paragraph Font"/>
     <w:uiPriority w:val="1"/>
     <w:semiHidden/>
     <w:unhideWhenUsed/>
   </w:style>
-  <w:style w:type="table" w:default="1" w:styleId="TableNormal">
+  <w:style w:type="table" w:default="1" w:styleId="Tablanormal">
     <w:name w:val="Normal Table"/>
     <w:uiPriority w:val="99"/>
     <w:semiHidden/>
@@ -11545,16 +11545,16 @@
       </w:tblCellMar>
     </w:tblPr>
   </w:style>
-  <w:style w:type="numbering" w:default="1" w:styleId="NoList">
+  <w:style w:type="numbering" w:default="1" w:styleId="Sinlista">
     <w:name w:val="No List"/>
     <w:uiPriority w:val="99"/>
     <w:semiHidden/>
     <w:unhideWhenUsed/>
   </w:style>
-  <w:style w:type="paragraph" w:styleId="BodyText">
+  <w:style w:type="paragraph" w:styleId="Textoindependiente">
     <w:name w:val="Body Text"/>
     <w:basedOn w:val="Normal"/>
-    <w:link w:val="BodyTextChar"/>
+    <w:link w:val="TextoindependienteCar"/>
     <w:rsid w:val="00A1476B"/>
     <w:pPr>
       <w:spacing w:after="0" w:line="240" w:lineRule="auto"/>
@@ -11566,10 +11566,10 @@
       <w:lang w:val="es-MX"/>
     </w:rPr>
   </w:style>
-  <w:style w:type="character" w:customStyle="1" w:styleId="BodyTextChar">
-    <w:name w:val="Body Text Char"/>
-    <w:basedOn w:val="DefaultParagraphFont"/>
-    <w:link w:val="BodyText"/>
+  <w:style w:type="character" w:customStyle="1" w:styleId="TextoindependienteCar">
+    <w:name w:val="Texto independiente Car"/>
+    <w:basedOn w:val="Fuentedeprrafopredeter"/>
+    <w:link w:val="Textoindependiente"/>
     <w:rsid w:val="00A1476B"/>
     <w:rPr>
       <w:rFonts w:ascii="Garamond" w:eastAsia="Times New Roman" w:hAnsi="Garamond" w:cs="Times New Roman"/>
@@ -11594,10 +11594,10 @@
       <w:szCs w:val="24"/>
     </w:rPr>
   </w:style>
-  <w:style w:type="paragraph" w:styleId="Header">
+  <w:style w:type="paragraph" w:styleId="Encabezado">
     <w:name w:val="header"/>
     <w:basedOn w:val="Normal"/>
-    <w:link w:val="HeaderChar"/>
+    <w:link w:val="EncabezadoCar"/>
     <w:uiPriority w:val="99"/>
     <w:unhideWhenUsed/>
     <w:rsid w:val="00A1476B"/>
@@ -11609,17 +11609,17 @@
       <w:spacing w:after="0" w:line="240" w:lineRule="auto"/>
     </w:pPr>
   </w:style>
-  <w:style w:type="character" w:customStyle="1" w:styleId="HeaderChar">
-    <w:name w:val="Header Char"/>
-    <w:basedOn w:val="DefaultParagraphFont"/>
-    <w:link w:val="Header"/>
+  <w:style w:type="character" w:customStyle="1" w:styleId="EncabezadoCar">
+    <w:name w:val="Encabezado Car"/>
+    <w:basedOn w:val="Fuentedeprrafopredeter"/>
+    <w:link w:val="Encabezado"/>
     <w:uiPriority w:val="99"/>
     <w:rsid w:val="00A1476B"/>
   </w:style>
-  <w:style w:type="paragraph" w:styleId="Footer">
+  <w:style w:type="paragraph" w:styleId="Piedepgina">
     <w:name w:val="footer"/>
     <w:basedOn w:val="Normal"/>
-    <w:link w:val="FooterChar"/>
+    <w:link w:val="PiedepginaCar"/>
     <w:unhideWhenUsed/>
     <w:rsid w:val="00A1476B"/>
     <w:pPr>
@@ -11630,16 +11630,16 @@
       <w:spacing w:after="0" w:line="240" w:lineRule="auto"/>
     </w:pPr>
   </w:style>
-  <w:style w:type="character" w:customStyle="1" w:styleId="FooterChar">
-    <w:name w:val="Footer Char"/>
-    <w:basedOn w:val="DefaultParagraphFont"/>
-    <w:link w:val="Footer"/>
+  <w:style w:type="character" w:customStyle="1" w:styleId="PiedepginaCar">
+    <w:name w:val="Pie de página Car"/>
+    <w:basedOn w:val="Fuentedeprrafopredeter"/>
+    <w:link w:val="Piedepgina"/>
     <w:rsid w:val="00A1476B"/>
   </w:style>
-  <w:style w:type="paragraph" w:styleId="BalloonText">
+  <w:style w:type="paragraph" w:styleId="Textodeglobo">
     <w:name w:val="Balloon Text"/>
     <w:basedOn w:val="Normal"/>
-    <w:link w:val="BalloonTextChar"/>
+    <w:link w:val="TextodegloboCar"/>
     <w:uiPriority w:val="99"/>
     <w:semiHidden/>
     <w:unhideWhenUsed/>
@@ -11653,10 +11653,10 @@
       <w:szCs w:val="16"/>
     </w:rPr>
   </w:style>
-  <w:style w:type="character" w:customStyle="1" w:styleId="BalloonTextChar">
-    <w:name w:val="Balloon Text Char"/>
-    <w:basedOn w:val="DefaultParagraphFont"/>
-    <w:link w:val="BalloonText"/>
+  <w:style w:type="character" w:customStyle="1" w:styleId="TextodegloboCar">
+    <w:name w:val="Texto de globo Car"/>
+    <w:basedOn w:val="Fuentedeprrafopredeter"/>
+    <w:link w:val="Textodeglobo"/>
     <w:uiPriority w:val="99"/>
     <w:semiHidden/>
     <w:rsid w:val="00A1476B"/>
@@ -11666,9 +11666,9 @@
       <w:szCs w:val="16"/>
     </w:rPr>
   </w:style>
-  <w:style w:type="table" w:styleId="TableGrid">
+  <w:style w:type="table" w:styleId="Tablaconcuadrcula">
     <w:name w:val="Table Grid"/>
-    <w:basedOn w:val="TableNormal"/>
+    <w:basedOn w:val="Tablanormal"/>
     <w:uiPriority w:val="59"/>
     <w:rsid w:val="00A1476B"/>
     <w:pPr>
@@ -11685,7 +11685,7 @@
       </w:tblBorders>
     </w:tblPr>
   </w:style>
-  <w:style w:type="paragraph" w:styleId="ListParagraph">
+  <w:style w:type="paragraph" w:styleId="Prrafodelista">
     <w:name w:val="List Paragraph"/>
     <w:basedOn w:val="Normal"/>
     <w:uiPriority w:val="34"/>
@@ -11696,10 +11696,10 @@
       <w:contextualSpacing/>
     </w:pPr>
   </w:style>
-  <w:style w:type="paragraph" w:styleId="FootnoteText">
+  <w:style w:type="paragraph" w:styleId="Textonotapie">
     <w:name w:val="footnote text"/>
     <w:basedOn w:val="Normal"/>
-    <w:link w:val="FootnoteTextChar"/>
+    <w:link w:val="TextonotapieCar"/>
     <w:uiPriority w:val="99"/>
     <w:semiHidden/>
     <w:unhideWhenUsed/>
@@ -11712,10 +11712,10 @@
       <w:szCs w:val="20"/>
     </w:rPr>
   </w:style>
-  <w:style w:type="character" w:customStyle="1" w:styleId="FootnoteTextChar">
-    <w:name w:val="Footnote Text Char"/>
-    <w:basedOn w:val="DefaultParagraphFont"/>
-    <w:link w:val="FootnoteText"/>
+  <w:style w:type="character" w:customStyle="1" w:styleId="TextonotapieCar">
+    <w:name w:val="Texto nota pie Car"/>
+    <w:basedOn w:val="Fuentedeprrafopredeter"/>
+    <w:link w:val="Textonotapie"/>
     <w:uiPriority w:val="99"/>
     <w:semiHidden/>
     <w:rsid w:val="004822AF"/>
@@ -11724,9 +11724,9 @@
       <w:szCs w:val="20"/>
     </w:rPr>
   </w:style>
-  <w:style w:type="character" w:styleId="FootnoteReference">
+  <w:style w:type="character" w:styleId="Refdenotaalpie">
     <w:name w:val="footnote reference"/>
-    <w:basedOn w:val="DefaultParagraphFont"/>
+    <w:basedOn w:val="Fuentedeprrafopredeter"/>
     <w:uiPriority w:val="99"/>
     <w:semiHidden/>
     <w:unhideWhenUsed/>

</xml_diff>